<commit_message>
segundo intento de commit
</commit_message>
<xml_diff>
--- a/Evidencias/Semana_9/Entregable semana 9.docx
+++ b/Evidencias/Semana_9/Entregable semana 9.docx
@@ -106,7 +106,7 @@
                             </pic:cNvPicPr>
                           </pic:nvPicPr>
                           <pic:blipFill>
-                            <a:blip r:embed="rId4">
+                            <a:blip r:embed="rId5">
                               <a:extLst>
                                 <a:ext uri="{28A0092B-C50C-407E-A947-70E740481C1C}">
                                   <a14:useLocalDpi xmlns:a14="http://schemas.microsoft.com/office/drawing/2010/main" val="0"/>
@@ -146,7 +146,7 @@
                             </pic:cNvPicPr>
                           </pic:nvPicPr>
                           <pic:blipFill>
-                            <a:blip r:embed="rId5">
+                            <a:blip r:embed="rId6">
                               <a:extLst>
                                 <a:ext uri="{28A0092B-C50C-407E-A947-70E740481C1C}">
                                   <a14:useLocalDpi xmlns:a14="http://schemas.microsoft.com/office/drawing/2010/main" val="0"/>
@@ -220,10 +220,10 @@
                     <o:lock v:ext="edit" aspectratio="t"/>
                   </v:shapetype>
                   <v:shape id="Shape 4" o:spid="_x0000_s1029" type="#_x0000_t75" style="position:absolute;width:11334;height:11049;visibility:visible;mso-wrap-style:square" o:preferrelative="f" o:gfxdata="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">
-                    <v:imagedata r:id="rId6" o:title=""/>
+                    <v:imagedata r:id="rId7" o:title=""/>
                   </v:shape>
                   <v:shape id="Shape 5" o:spid="_x0000_s1030" type="#_x0000_t75" style="position:absolute;left:44330;width:11240;height:11334;visibility:visible;mso-wrap-style:square" o:preferrelative="f" o:gfxdata="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">
-                    <v:imagedata r:id="rId7" o:title=""/>
+                    <v:imagedata r:id="rId8" o:title=""/>
                   </v:shape>
                 </v:group>
                 <w10:anchorlock/>
@@ -366,41 +366,45 @@
           <w:sz w:val="32"/>
           <w:szCs w:val="32"/>
         </w:rPr>
-        <w:t xml:space="preserve">Materia: </w:t>
-      </w:r>
+        <w:t xml:space="preserve">Materia: Típicos avanzados de programación </w:t>
+      </w:r>
+    </w:p>
+    <w:p>
+      <w:pPr>
+        <w:spacing w:line="276" w:lineRule="auto"/>
+        <w:ind w:right="797"/>
+        <w:jc w:val="center"/>
+        <w:rPr>
+          <w:rFonts w:ascii="Arial" w:eastAsia="Arial" w:hAnsi="Arial" w:cs="Arial"/>
+        </w:rPr>
+      </w:pPr>
       <w:r>
         <w:rPr>
           <w:rFonts w:ascii="Arial" w:eastAsia="Arial" w:hAnsi="Arial" w:cs="Arial"/>
           <w:sz w:val="32"/>
           <w:szCs w:val="32"/>
         </w:rPr>
-        <w:t xml:space="preserve">Típicos avanzados de programación </w:t>
-      </w:r>
-    </w:p>
-    <w:p>
-      <w:pPr>
-        <w:spacing w:line="276" w:lineRule="auto"/>
-        <w:ind w:right="797"/>
+        <w:t>Docente: Mtro. José de Jesús Collazo Reyes</w:t>
+      </w:r>
+    </w:p>
+    <w:p>
+      <w:pPr>
+        <w:spacing w:after="0" w:line="379" w:lineRule="auto"/>
+        <w:ind w:right="200"/>
         <w:jc w:val="center"/>
-        <w:rPr>
-          <w:rFonts w:ascii="Arial" w:eastAsia="Arial" w:hAnsi="Arial" w:cs="Arial"/>
-        </w:rPr>
-      </w:pPr>
-      <w:r>
         <w:rPr>
           <w:rFonts w:ascii="Arial" w:eastAsia="Arial" w:hAnsi="Arial" w:cs="Arial"/>
           <w:sz w:val="32"/>
           <w:szCs w:val="32"/>
         </w:rPr>
-        <w:t xml:space="preserve">Docente: </w:t>
-      </w:r>
+      </w:pPr>
       <w:r>
         <w:rPr>
           <w:rFonts w:ascii="Arial" w:eastAsia="Arial" w:hAnsi="Arial" w:cs="Arial"/>
           <w:sz w:val="32"/>
           <w:szCs w:val="32"/>
         </w:rPr>
-        <w:t>Mtro. José de Jesús Collazo Reyes</w:t>
+        <w:t>Fecha de entrega: 17 de abril de 2026</w:t>
       </w:r>
     </w:p>
     <w:p>
@@ -410,8 +414,6 @@
         <w:jc w:val="center"/>
         <w:rPr>
           <w:rFonts w:ascii="Arial" w:eastAsia="Arial" w:hAnsi="Arial" w:cs="Arial"/>
-          <w:sz w:val="32"/>
-          <w:szCs w:val="32"/>
         </w:rPr>
       </w:pPr>
       <w:r>
@@ -420,29 +422,43 @@
           <w:sz w:val="32"/>
           <w:szCs w:val="32"/>
         </w:rPr>
-        <w:t xml:space="preserve">Fecha de entrega: </w:t>
-      </w:r>
-      <w:r>
+        <w:t>Alumno:</w:t>
+      </w:r>
+    </w:p>
+    <w:p>
+      <w:pPr>
+        <w:spacing w:after="414" w:line="266" w:lineRule="auto"/>
+        <w:ind w:right="200"/>
+        <w:jc w:val="center"/>
         <w:rPr>
           <w:rFonts w:ascii="Arial" w:eastAsia="Arial" w:hAnsi="Arial" w:cs="Arial"/>
           <w:sz w:val="32"/>
           <w:szCs w:val="32"/>
         </w:rPr>
-        <w:t>17 de abril</w:t>
-      </w:r>
+      </w:pPr>
       <w:r>
         <w:rPr>
           <w:rFonts w:ascii="Arial" w:eastAsia="Arial" w:hAnsi="Arial" w:cs="Arial"/>
           <w:sz w:val="32"/>
           <w:szCs w:val="32"/>
         </w:rPr>
-        <w:t xml:space="preserve"> de 2026</w:t>
-      </w:r>
-    </w:p>
-    <w:p>
-      <w:pPr>
-        <w:spacing w:after="0" w:line="379" w:lineRule="auto"/>
-        <w:ind w:right="200"/>
+        <w:t>Hernandez Giselle Guadalupe (242240015)</w:t>
+      </w:r>
+    </w:p>
+    <w:p>
+      <w:pPr>
+        <w:spacing w:after="238"/>
+        <w:ind w:right="69"/>
+        <w:jc w:val="center"/>
+        <w:rPr>
+          <w:rFonts w:ascii="Arial" w:eastAsia="Arial" w:hAnsi="Arial" w:cs="Arial"/>
+        </w:rPr>
+      </w:pPr>
+    </w:p>
+    <w:p>
+      <w:pPr>
+        <w:spacing w:after="438"/>
+        <w:ind w:right="116"/>
         <w:jc w:val="center"/>
         <w:rPr>
           <w:rFonts w:ascii="Arial" w:eastAsia="Arial" w:hAnsi="Arial" w:cs="Arial"/>
@@ -454,62 +470,6 @@
           <w:sz w:val="32"/>
           <w:szCs w:val="32"/>
         </w:rPr>
-        <w:t>Alumno</w:t>
-      </w:r>
-      <w:r>
-        <w:rPr>
-          <w:rFonts w:ascii="Arial" w:eastAsia="Arial" w:hAnsi="Arial" w:cs="Arial"/>
-          <w:sz w:val="32"/>
-          <w:szCs w:val="32"/>
-        </w:rPr>
-        <w:t>:</w:t>
-      </w:r>
-    </w:p>
-    <w:p>
-      <w:pPr>
-        <w:spacing w:after="414" w:line="266" w:lineRule="auto"/>
-        <w:ind w:right="200"/>
-        <w:jc w:val="center"/>
-        <w:rPr>
-          <w:rFonts w:ascii="Arial" w:eastAsia="Arial" w:hAnsi="Arial" w:cs="Arial"/>
-          <w:sz w:val="32"/>
-          <w:szCs w:val="32"/>
-        </w:rPr>
-      </w:pPr>
-      <w:r>
-        <w:rPr>
-          <w:rFonts w:ascii="Arial" w:eastAsia="Arial" w:hAnsi="Arial" w:cs="Arial"/>
-          <w:sz w:val="32"/>
-          <w:szCs w:val="32"/>
-        </w:rPr>
-        <w:t>Hernandez Giselle Guadalupe (242240015)</w:t>
-      </w:r>
-    </w:p>
-    <w:p>
-      <w:pPr>
-        <w:spacing w:after="238"/>
-        <w:ind w:right="69"/>
-        <w:jc w:val="center"/>
-        <w:rPr>
-          <w:rFonts w:ascii="Arial" w:eastAsia="Arial" w:hAnsi="Arial" w:cs="Arial"/>
-        </w:rPr>
-      </w:pPr>
-    </w:p>
-    <w:p>
-      <w:pPr>
-        <w:spacing w:after="438"/>
-        <w:ind w:right="116"/>
-        <w:jc w:val="center"/>
-        <w:rPr>
-          <w:rFonts w:ascii="Arial" w:eastAsia="Arial" w:hAnsi="Arial" w:cs="Arial"/>
-        </w:rPr>
-      </w:pPr>
-      <w:r>
-        <w:rPr>
-          <w:rFonts w:ascii="Arial" w:eastAsia="Arial" w:hAnsi="Arial" w:cs="Arial"/>
-          <w:sz w:val="32"/>
-          <w:szCs w:val="32"/>
-        </w:rPr>
         <w:t>Rioverde, San Luis Potosí</w:t>
       </w:r>
     </w:p>
@@ -522,7 +482,17 @@
       </w:r>
     </w:p>
     <w:p>
-      <w:r>
+      <w:pPr>
+        <w:rPr>
+          <w:b/>
+          <w:bCs/>
+        </w:rPr>
+      </w:pPr>
+      <w:r>
+        <w:rPr>
+          <w:b/>
+          <w:bCs/>
+        </w:rPr>
         <w:lastRenderedPageBreak/>
         <w:t>Descripción del sistema:</w:t>
       </w:r>
@@ -582,13 +552,7 @@
     <w:p>
       <w:proofErr w:type="spellStart"/>
       <w:r>
-        <w:t>co</w:t>
-      </w:r>
-      <w:r>
-        <w:t>nexion</w:t>
-      </w:r>
-      <w:r>
-        <w:t>.php</w:t>
+        <w:t>conexion.php</w:t>
       </w:r>
       <w:proofErr w:type="spellEnd"/>
       <w:r>
@@ -635,10 +599,7 @@
     </w:p>
     <w:p>
       <w:r>
-        <w:t xml:space="preserve">Dentro de este archivo se crea la tabla de alumnos </w:t>
-      </w:r>
-      <w:r>
-        <w:t>si es que aún no existe</w:t>
+        <w:t>Dentro de este archivo se crea la tabla de alumnos si es que aún no existe</w:t>
       </w:r>
       <w:r>
         <w:t>,</w:t>
@@ -725,7 +686,7 @@
     </w:p>
     <w:p>
       <w:r>
-        <w:t>¿Cómo se relacionan todos los archivos entre sí?</w:t>
+        <w:t>¿Cómo se relacionan los archivos entre sí?</w:t>
       </w:r>
     </w:p>
     <w:p>
@@ -1034,18 +995,1423 @@
         <w:t>, si se tiene que hacer algún cambio solo se modifican en la configuración, lo que nos facilita el mantenimiento del sistema.</w:t>
       </w:r>
     </w:p>
-    <w:p/>
-    <w:p>
-      <w:r>
+    <w:p>
+      <w:pPr>
+        <w:pStyle w:val="NormalWeb"/>
+        <w:jc w:val="both"/>
+        <w:rPr>
+          <w:rFonts w:ascii="Calibri" w:eastAsia="Calibri" w:hAnsi="Calibri" w:cs="Calibri"/>
+          <w:b/>
+          <w:bCs/>
+          <w:sz w:val="22"/>
+          <w:szCs w:val="22"/>
+        </w:rPr>
+      </w:pPr>
+      <w:r>
+        <w:rPr>
+          <w:rFonts w:ascii="Calibri" w:eastAsia="Calibri" w:hAnsi="Calibri" w:cs="Calibri"/>
+          <w:b/>
+          <w:bCs/>
+          <w:sz w:val="22"/>
+          <w:szCs w:val="22"/>
+        </w:rPr>
+        <w:t>Flujo de la información:</w:t>
+      </w:r>
+    </w:p>
+    <w:p>
+      <w:pPr>
+        <w:spacing w:before="100" w:beforeAutospacing="1" w:after="100" w:afterAutospacing="1" w:line="240" w:lineRule="auto"/>
+        <w:jc w:val="both"/>
+      </w:pPr>
+      <w:r>
+        <w:t xml:space="preserve">Cuando se ejecuta el archivo </w:t>
+      </w:r>
+      <w:proofErr w:type="spellStart"/>
+      <w:r>
+        <w:t>insertar.php</w:t>
+      </w:r>
+      <w:proofErr w:type="spellEnd"/>
+      <w:r>
+        <w:t xml:space="preserve">, el sistema primero carga el archivo </w:t>
+      </w:r>
+      <w:proofErr w:type="spellStart"/>
+      <w:r>
+        <w:t>config.php</w:t>
+      </w:r>
+      <w:proofErr w:type="spellEnd"/>
+      <w:r>
+        <w:t xml:space="preserve"> </w:t>
+      </w:r>
+      <w:r>
+        <w:t>utilizando el</w:t>
+      </w:r>
+      <w:r>
+        <w:t xml:space="preserve"> </w:t>
+      </w:r>
+      <w:proofErr w:type="spellStart"/>
+      <w:r>
+        <w:t>require_once</w:t>
+      </w:r>
+      <w:proofErr w:type="spellEnd"/>
+      <w:r>
+        <w:t xml:space="preserve">, donde </w:t>
+      </w:r>
+      <w:r>
+        <w:t>están</w:t>
+      </w:r>
+      <w:r>
+        <w:t xml:space="preserve"> los datos de conexión a la base de datos. Con esta información se </w:t>
+      </w:r>
+      <w:r>
+        <w:t>crea</w:t>
+      </w:r>
+      <w:r>
+        <w:t xml:space="preserve"> la conexión al servidor MySQL usando</w:t>
+      </w:r>
+      <w:r>
+        <w:t xml:space="preserve"> un nuevo objeto</w:t>
+      </w:r>
+      <w:r>
+        <w:t xml:space="preserve"> </w:t>
+      </w:r>
+      <w:r>
+        <w:t>(</w:t>
+      </w:r>
+      <w:r>
+        <w:t xml:space="preserve">new </w:t>
+      </w:r>
+      <w:proofErr w:type="spellStart"/>
+      <w:r>
+        <w:t>mysqli</w:t>
+      </w:r>
+      <w:proofErr w:type="spellEnd"/>
+      <w:r>
+        <w:t>)</w:t>
+      </w:r>
+      <w:r>
+        <w:t>.</w:t>
+      </w:r>
+      <w:r>
+        <w:t xml:space="preserve"> </w:t>
+      </w:r>
+      <w:r>
+        <w:t xml:space="preserve">Luego, el sistema recibe los datos enviados desde el formulario de </w:t>
+      </w:r>
+      <w:proofErr w:type="spellStart"/>
+      <w:r>
+        <w:t>index.php</w:t>
+      </w:r>
+      <w:proofErr w:type="spellEnd"/>
+      <w:r>
+        <w:t>. Estos datos se utilizan para construir una consulta SQL de tipo INSERT, la cual se ejecuta para almacenar la información en la base de datos.</w:t>
+      </w:r>
+      <w:r>
+        <w:t xml:space="preserve"> </w:t>
+      </w:r>
+      <w:r>
+        <w:t xml:space="preserve">Después, los datos quedan guardados en la base de datos y se puede realizar una consulta SELECT para recuperarlos. El resultado de esta consulta se procesa con </w:t>
+      </w:r>
+      <w:proofErr w:type="spellStart"/>
+      <w:r>
+        <w:t>fetch_assoc</w:t>
+      </w:r>
+      <w:proofErr w:type="spellEnd"/>
+      <w:r>
+        <w:t>(), que permite obtener los registros fila por fila.</w:t>
+      </w:r>
+      <w:r>
+        <w:t xml:space="preserve"> </w:t>
+      </w:r>
+      <w:r>
+        <w:t>Finalmente, la información obtenida se muestra en el navegador mediante echo, permitiendo su visualización en pantalla.</w:t>
+      </w:r>
+    </w:p>
+    <w:p>
+      <w:pPr>
+        <w:pStyle w:val="NormalWeb"/>
+        <w:jc w:val="both"/>
+        <w:rPr>
+          <w:rFonts w:ascii="Calibri" w:eastAsia="Calibri" w:hAnsi="Calibri" w:cs="Calibri"/>
+          <w:b/>
+          <w:bCs/>
+          <w:sz w:val="22"/>
+          <w:szCs w:val="22"/>
+        </w:rPr>
+      </w:pPr>
+      <w:r>
+        <w:rPr>
+          <w:rFonts w:ascii="Calibri" w:eastAsia="Calibri" w:hAnsi="Calibri" w:cs="Calibri"/>
+          <w:b/>
+          <w:bCs/>
+          <w:sz w:val="22"/>
+          <w:szCs w:val="22"/>
+        </w:rPr>
+        <w:t>Análisis del código:</w:t>
+      </w:r>
+    </w:p>
+    <w:p>
+      <w:pPr>
+        <w:shd w:val="clear" w:color="auto" w:fill="121314"/>
+        <w:spacing w:after="0" w:line="285" w:lineRule="atLeast"/>
+        <w:rPr>
+          <w:rFonts w:ascii="Consolas" w:eastAsia="Times New Roman" w:hAnsi="Consolas" w:cs="Times New Roman"/>
+          <w:color w:val="BBBEBF"/>
+          <w:sz w:val="21"/>
+          <w:szCs w:val="21"/>
+        </w:rPr>
+      </w:pPr>
+      <w:r>
+        <w:rPr>
+          <w:rFonts w:ascii="Consolas" w:eastAsia="Times New Roman" w:hAnsi="Consolas" w:cs="Times New Roman"/>
+          <w:color w:val="569CD6"/>
+          <w:sz w:val="21"/>
+          <w:szCs w:val="21"/>
+        </w:rPr>
+        <w:t>&lt;?php</w:t>
+      </w:r>
+      <w:r>
+        <w:rPr>
+          <w:rFonts w:ascii="Consolas" w:eastAsia="Times New Roman" w:hAnsi="Consolas" w:cs="Times New Roman"/>
+          <w:color w:val="D4D4D4"/>
+          <w:sz w:val="21"/>
+          <w:szCs w:val="21"/>
+        </w:rPr>
+        <w:t xml:space="preserve"> </w:t>
+      </w:r>
+      <w:r>
+        <w:rPr>
+          <w:rFonts w:ascii="Consolas" w:eastAsia="Times New Roman" w:hAnsi="Consolas" w:cs="Times New Roman"/>
+          <w:color w:val="8B949E"/>
+          <w:sz w:val="21"/>
+          <w:szCs w:val="21"/>
+        </w:rPr>
+        <w:t xml:space="preserve">#Inicia el </w:t>
+      </w:r>
+      <w:proofErr w:type="spellStart"/>
+      <w:r>
+        <w:rPr>
+          <w:rFonts w:ascii="Consolas" w:eastAsia="Times New Roman" w:hAnsi="Consolas" w:cs="Times New Roman"/>
+          <w:color w:val="8B949E"/>
+          <w:sz w:val="21"/>
+          <w:szCs w:val="21"/>
+        </w:rPr>
+        <w:t>codigo</w:t>
+      </w:r>
+      <w:proofErr w:type="spellEnd"/>
+      <w:r>
+        <w:rPr>
+          <w:rFonts w:ascii="Consolas" w:eastAsia="Times New Roman" w:hAnsi="Consolas" w:cs="Times New Roman"/>
+          <w:color w:val="8B949E"/>
+          <w:sz w:val="21"/>
+          <w:szCs w:val="21"/>
+        </w:rPr>
+        <w:t xml:space="preserve"> php. Se le tiene que indicar el tipo de </w:t>
+      </w:r>
+      <w:proofErr w:type="spellStart"/>
+      <w:r>
+        <w:rPr>
+          <w:rFonts w:ascii="Consolas" w:eastAsia="Times New Roman" w:hAnsi="Consolas" w:cs="Times New Roman"/>
+          <w:color w:val="8B949E"/>
+          <w:sz w:val="21"/>
+          <w:szCs w:val="21"/>
+        </w:rPr>
+        <w:t>codigo</w:t>
+      </w:r>
+      <w:proofErr w:type="spellEnd"/>
+      <w:r>
+        <w:rPr>
+          <w:rFonts w:ascii="Consolas" w:eastAsia="Times New Roman" w:hAnsi="Consolas" w:cs="Times New Roman"/>
+          <w:color w:val="8B949E"/>
+          <w:sz w:val="21"/>
+          <w:szCs w:val="21"/>
+        </w:rPr>
+        <w:t xml:space="preserve"> al servidor para que sepa que son indicaciones </w:t>
+      </w:r>
+    </w:p>
+    <w:p>
+      <w:pPr>
+        <w:shd w:val="clear" w:color="auto" w:fill="121314"/>
+        <w:spacing w:after="0" w:line="285" w:lineRule="atLeast"/>
+        <w:rPr>
+          <w:rFonts w:ascii="Consolas" w:eastAsia="Times New Roman" w:hAnsi="Consolas" w:cs="Times New Roman"/>
+          <w:color w:val="BBBEBF"/>
+          <w:sz w:val="21"/>
+          <w:szCs w:val="21"/>
+        </w:rPr>
+      </w:pPr>
+      <w:proofErr w:type="spellStart"/>
+      <w:r>
+        <w:rPr>
+          <w:rFonts w:ascii="Consolas" w:eastAsia="Times New Roman" w:hAnsi="Consolas" w:cs="Times New Roman"/>
+          <w:color w:val="C586C0"/>
+          <w:sz w:val="21"/>
+          <w:szCs w:val="21"/>
+        </w:rPr>
+        <w:t>require_once</w:t>
+      </w:r>
+      <w:proofErr w:type="spellEnd"/>
+      <w:r>
+        <w:rPr>
+          <w:rFonts w:ascii="Consolas" w:eastAsia="Times New Roman" w:hAnsi="Consolas" w:cs="Times New Roman"/>
+          <w:color w:val="D4D4D4"/>
+          <w:sz w:val="21"/>
+          <w:szCs w:val="21"/>
+        </w:rPr>
+        <w:t xml:space="preserve"> </w:t>
+      </w:r>
+      <w:r>
+        <w:rPr>
+          <w:rFonts w:ascii="Consolas" w:eastAsia="Times New Roman" w:hAnsi="Consolas" w:cs="Times New Roman"/>
+          <w:color w:val="A5D6FF"/>
+          <w:sz w:val="21"/>
+          <w:szCs w:val="21"/>
+        </w:rPr>
+        <w:t>"</w:t>
+      </w:r>
+      <w:proofErr w:type="spellStart"/>
+      <w:r>
+        <w:rPr>
+          <w:rFonts w:ascii="Consolas" w:eastAsia="Times New Roman" w:hAnsi="Consolas" w:cs="Times New Roman"/>
+          <w:color w:val="A5D6FF"/>
+          <w:sz w:val="21"/>
+          <w:szCs w:val="21"/>
+        </w:rPr>
+        <w:t>config.php</w:t>
+      </w:r>
+      <w:proofErr w:type="spellEnd"/>
+      <w:r>
+        <w:rPr>
+          <w:rFonts w:ascii="Consolas" w:eastAsia="Times New Roman" w:hAnsi="Consolas" w:cs="Times New Roman"/>
+          <w:color w:val="A5D6FF"/>
+          <w:sz w:val="21"/>
+          <w:szCs w:val="21"/>
+        </w:rPr>
+        <w:t>"</w:t>
+      </w:r>
+      <w:r>
+        <w:rPr>
+          <w:rFonts w:ascii="Consolas" w:eastAsia="Times New Roman" w:hAnsi="Consolas" w:cs="Times New Roman"/>
+          <w:color w:val="D4D4D4"/>
+          <w:sz w:val="21"/>
+          <w:szCs w:val="21"/>
+        </w:rPr>
+        <w:t xml:space="preserve">; </w:t>
+      </w:r>
+      <w:r>
+        <w:rPr>
+          <w:rFonts w:ascii="Consolas" w:eastAsia="Times New Roman" w:hAnsi="Consolas" w:cs="Times New Roman"/>
+          <w:color w:val="8B949E"/>
+          <w:sz w:val="21"/>
+          <w:szCs w:val="21"/>
+        </w:rPr>
+        <w:t xml:space="preserve">#Incluye el archivo de </w:t>
+      </w:r>
+      <w:proofErr w:type="spellStart"/>
+      <w:r>
+        <w:rPr>
+          <w:rFonts w:ascii="Consolas" w:eastAsia="Times New Roman" w:hAnsi="Consolas" w:cs="Times New Roman"/>
+          <w:color w:val="8B949E"/>
+          <w:sz w:val="21"/>
+          <w:szCs w:val="21"/>
+        </w:rPr>
+        <w:t>config.php</w:t>
+      </w:r>
+      <w:proofErr w:type="spellEnd"/>
+      <w:r>
+        <w:rPr>
+          <w:rFonts w:ascii="Consolas" w:eastAsia="Times New Roman" w:hAnsi="Consolas" w:cs="Times New Roman"/>
+          <w:color w:val="8B949E"/>
+          <w:sz w:val="21"/>
+          <w:szCs w:val="21"/>
+        </w:rPr>
+        <w:t xml:space="preserve"> una </w:t>
+      </w:r>
+      <w:proofErr w:type="spellStart"/>
+      <w:r>
+        <w:rPr>
+          <w:rFonts w:ascii="Consolas" w:eastAsia="Times New Roman" w:hAnsi="Consolas" w:cs="Times New Roman"/>
+          <w:color w:val="8B949E"/>
+          <w:sz w:val="21"/>
+          <w:szCs w:val="21"/>
+        </w:rPr>
+        <w:t>unica</w:t>
+      </w:r>
+      <w:proofErr w:type="spellEnd"/>
+      <w:r>
+        <w:rPr>
+          <w:rFonts w:ascii="Consolas" w:eastAsia="Times New Roman" w:hAnsi="Consolas" w:cs="Times New Roman"/>
+          <w:color w:val="8B949E"/>
+          <w:sz w:val="21"/>
+          <w:szCs w:val="21"/>
+        </w:rPr>
+        <w:t xml:space="preserve"> vez. Gracias a esta </w:t>
+      </w:r>
+      <w:proofErr w:type="spellStart"/>
+      <w:r>
+        <w:rPr>
+          <w:rFonts w:ascii="Consolas" w:eastAsia="Times New Roman" w:hAnsi="Consolas" w:cs="Times New Roman"/>
+          <w:color w:val="8B949E"/>
+          <w:sz w:val="21"/>
+          <w:szCs w:val="21"/>
+        </w:rPr>
+        <w:t>linea</w:t>
+      </w:r>
+      <w:proofErr w:type="spellEnd"/>
+      <w:r>
+        <w:rPr>
+          <w:rFonts w:ascii="Consolas" w:eastAsia="Times New Roman" w:hAnsi="Consolas" w:cs="Times New Roman"/>
+          <w:color w:val="8B949E"/>
+          <w:sz w:val="21"/>
+          <w:szCs w:val="21"/>
+        </w:rPr>
+        <w:t xml:space="preserve"> se logra que el archivo se cargue de manera obligatoria y que no se incluyan las variables </w:t>
+      </w:r>
+      <w:proofErr w:type="spellStart"/>
+      <w:r>
+        <w:rPr>
+          <w:rFonts w:ascii="Consolas" w:eastAsia="Times New Roman" w:hAnsi="Consolas" w:cs="Times New Roman"/>
+          <w:color w:val="8B949E"/>
+          <w:sz w:val="21"/>
+          <w:szCs w:val="21"/>
+        </w:rPr>
+        <w:t>mas</w:t>
+      </w:r>
+      <w:proofErr w:type="spellEnd"/>
+      <w:r>
+        <w:rPr>
+          <w:rFonts w:ascii="Consolas" w:eastAsia="Times New Roman" w:hAnsi="Consolas" w:cs="Times New Roman"/>
+          <w:color w:val="8B949E"/>
+          <w:sz w:val="21"/>
+          <w:szCs w:val="21"/>
+        </w:rPr>
+        <w:t xml:space="preserve"> de una vez lo que nos reduce la probabilidad de fallos y errores.</w:t>
+      </w:r>
+    </w:p>
+    <w:p>
+      <w:pPr>
+        <w:shd w:val="clear" w:color="auto" w:fill="121314"/>
+        <w:spacing w:after="0" w:line="285" w:lineRule="atLeast"/>
+        <w:rPr>
+          <w:rFonts w:ascii="Consolas" w:eastAsia="Times New Roman" w:hAnsi="Consolas" w:cs="Times New Roman"/>
+          <w:color w:val="BBBEBF"/>
+          <w:sz w:val="21"/>
+          <w:szCs w:val="21"/>
+        </w:rPr>
+      </w:pPr>
+      <w:r>
+        <w:rPr>
+          <w:rFonts w:ascii="Consolas" w:eastAsia="Times New Roman" w:hAnsi="Consolas" w:cs="Times New Roman"/>
+          <w:color w:val="C9D1D9"/>
+          <w:sz w:val="21"/>
+          <w:szCs w:val="21"/>
+        </w:rPr>
+        <w:t>$</w:t>
+      </w:r>
+      <w:proofErr w:type="spellStart"/>
+      <w:r>
+        <w:rPr>
+          <w:rFonts w:ascii="Consolas" w:eastAsia="Times New Roman" w:hAnsi="Consolas" w:cs="Times New Roman"/>
+          <w:color w:val="C9D1D9"/>
+          <w:sz w:val="21"/>
+          <w:szCs w:val="21"/>
+        </w:rPr>
+        <w:t>conexion</w:t>
+      </w:r>
+      <w:proofErr w:type="spellEnd"/>
+      <w:r>
+        <w:rPr>
+          <w:rFonts w:ascii="Consolas" w:eastAsia="Times New Roman" w:hAnsi="Consolas" w:cs="Times New Roman"/>
+          <w:color w:val="D4D4D4"/>
+          <w:sz w:val="21"/>
+          <w:szCs w:val="21"/>
+        </w:rPr>
+        <w:t xml:space="preserve"> = </w:t>
+      </w:r>
+      <w:r>
+        <w:rPr>
+          <w:rFonts w:ascii="Consolas" w:eastAsia="Times New Roman" w:hAnsi="Consolas" w:cs="Times New Roman"/>
+          <w:color w:val="FF7B72"/>
+          <w:sz w:val="21"/>
+          <w:szCs w:val="21"/>
+        </w:rPr>
+        <w:t>new</w:t>
+      </w:r>
+      <w:r>
+        <w:rPr>
+          <w:rFonts w:ascii="Consolas" w:eastAsia="Times New Roman" w:hAnsi="Consolas" w:cs="Times New Roman"/>
+          <w:color w:val="D4D4D4"/>
+          <w:sz w:val="21"/>
+          <w:szCs w:val="21"/>
+        </w:rPr>
+        <w:t xml:space="preserve"> </w:t>
+      </w:r>
+      <w:proofErr w:type="spellStart"/>
+      <w:r>
+        <w:rPr>
+          <w:rFonts w:ascii="Consolas" w:eastAsia="Times New Roman" w:hAnsi="Consolas" w:cs="Times New Roman"/>
+          <w:color w:val="4EC9B0"/>
+          <w:sz w:val="21"/>
+          <w:szCs w:val="21"/>
+        </w:rPr>
+        <w:t>mysqli</w:t>
+      </w:r>
+      <w:proofErr w:type="spellEnd"/>
+      <w:r>
+        <w:rPr>
+          <w:rFonts w:ascii="Consolas" w:eastAsia="Times New Roman" w:hAnsi="Consolas" w:cs="Times New Roman"/>
+          <w:color w:val="D4D4D4"/>
+          <w:sz w:val="21"/>
+          <w:szCs w:val="21"/>
+        </w:rPr>
+        <w:t>(</w:t>
+      </w:r>
+      <w:r>
+        <w:rPr>
+          <w:rFonts w:ascii="Consolas" w:eastAsia="Times New Roman" w:hAnsi="Consolas" w:cs="Times New Roman"/>
+          <w:color w:val="C9D1D9"/>
+          <w:sz w:val="21"/>
+          <w:szCs w:val="21"/>
+        </w:rPr>
+        <w:t>$host</w:t>
+      </w:r>
+      <w:r>
+        <w:rPr>
+          <w:rFonts w:ascii="Consolas" w:eastAsia="Times New Roman" w:hAnsi="Consolas" w:cs="Times New Roman"/>
+          <w:color w:val="D4D4D4"/>
+          <w:sz w:val="21"/>
+          <w:szCs w:val="21"/>
+        </w:rPr>
+        <w:t xml:space="preserve">, </w:t>
+      </w:r>
+      <w:r>
+        <w:rPr>
+          <w:rFonts w:ascii="Consolas" w:eastAsia="Times New Roman" w:hAnsi="Consolas" w:cs="Times New Roman"/>
+          <w:color w:val="C9D1D9"/>
+          <w:sz w:val="21"/>
+          <w:szCs w:val="21"/>
+        </w:rPr>
+        <w:t>$</w:t>
+      </w:r>
+      <w:proofErr w:type="spellStart"/>
+      <w:r>
+        <w:rPr>
+          <w:rFonts w:ascii="Consolas" w:eastAsia="Times New Roman" w:hAnsi="Consolas" w:cs="Times New Roman"/>
+          <w:color w:val="C9D1D9"/>
+          <w:sz w:val="21"/>
+          <w:szCs w:val="21"/>
+        </w:rPr>
+        <w:t>user</w:t>
+      </w:r>
+      <w:proofErr w:type="spellEnd"/>
+      <w:r>
+        <w:rPr>
+          <w:rFonts w:ascii="Consolas" w:eastAsia="Times New Roman" w:hAnsi="Consolas" w:cs="Times New Roman"/>
+          <w:color w:val="D4D4D4"/>
+          <w:sz w:val="21"/>
+          <w:szCs w:val="21"/>
+        </w:rPr>
+        <w:t xml:space="preserve">, </w:t>
+      </w:r>
+      <w:r>
+        <w:rPr>
+          <w:rFonts w:ascii="Consolas" w:eastAsia="Times New Roman" w:hAnsi="Consolas" w:cs="Times New Roman"/>
+          <w:color w:val="C9D1D9"/>
+          <w:sz w:val="21"/>
+          <w:szCs w:val="21"/>
+        </w:rPr>
+        <w:t>$</w:t>
+      </w:r>
+      <w:proofErr w:type="spellStart"/>
+      <w:r>
+        <w:rPr>
+          <w:rFonts w:ascii="Consolas" w:eastAsia="Times New Roman" w:hAnsi="Consolas" w:cs="Times New Roman"/>
+          <w:color w:val="C9D1D9"/>
+          <w:sz w:val="21"/>
+          <w:szCs w:val="21"/>
+        </w:rPr>
+        <w:t>pass</w:t>
+      </w:r>
+      <w:proofErr w:type="spellEnd"/>
+      <w:r>
+        <w:rPr>
+          <w:rFonts w:ascii="Consolas" w:eastAsia="Times New Roman" w:hAnsi="Consolas" w:cs="Times New Roman"/>
+          <w:color w:val="D4D4D4"/>
+          <w:sz w:val="21"/>
+          <w:szCs w:val="21"/>
+        </w:rPr>
+        <w:t xml:space="preserve">); </w:t>
+      </w:r>
+      <w:r>
+        <w:rPr>
+          <w:rFonts w:ascii="Consolas" w:eastAsia="Times New Roman" w:hAnsi="Consolas" w:cs="Times New Roman"/>
+          <w:color w:val="8B949E"/>
+          <w:sz w:val="21"/>
+          <w:szCs w:val="21"/>
+        </w:rPr>
+        <w:t xml:space="preserve"># Crea una </w:t>
+      </w:r>
+      <w:proofErr w:type="spellStart"/>
+      <w:r>
+        <w:rPr>
+          <w:rFonts w:ascii="Consolas" w:eastAsia="Times New Roman" w:hAnsi="Consolas" w:cs="Times New Roman"/>
+          <w:color w:val="8B949E"/>
+          <w:sz w:val="21"/>
+          <w:szCs w:val="21"/>
+        </w:rPr>
+        <w:t>conexion</w:t>
+      </w:r>
+      <w:proofErr w:type="spellEnd"/>
+      <w:r>
+        <w:rPr>
+          <w:rFonts w:ascii="Consolas" w:eastAsia="Times New Roman" w:hAnsi="Consolas" w:cs="Times New Roman"/>
+          <w:color w:val="8B949E"/>
+          <w:sz w:val="21"/>
+          <w:szCs w:val="21"/>
+        </w:rPr>
+        <w:t xml:space="preserve"> al servidor de la base de datos. </w:t>
+      </w:r>
+    </w:p>
+    <w:p>
+      <w:pPr>
+        <w:shd w:val="clear" w:color="auto" w:fill="121314"/>
+        <w:spacing w:after="0" w:line="285" w:lineRule="atLeast"/>
+        <w:rPr>
+          <w:rFonts w:ascii="Consolas" w:eastAsia="Times New Roman" w:hAnsi="Consolas" w:cs="Times New Roman"/>
+          <w:color w:val="BBBEBF"/>
+          <w:sz w:val="21"/>
+          <w:szCs w:val="21"/>
+        </w:rPr>
+      </w:pPr>
+    </w:p>
+    <w:p>
+      <w:pPr>
+        <w:shd w:val="clear" w:color="auto" w:fill="121314"/>
+        <w:spacing w:after="0" w:line="285" w:lineRule="atLeast"/>
+        <w:rPr>
+          <w:rFonts w:ascii="Consolas" w:eastAsia="Times New Roman" w:hAnsi="Consolas" w:cs="Times New Roman"/>
+          <w:color w:val="BBBEBF"/>
+          <w:sz w:val="21"/>
+          <w:szCs w:val="21"/>
+        </w:rPr>
+      </w:pPr>
+      <w:proofErr w:type="spellStart"/>
+      <w:r>
+        <w:rPr>
+          <w:rFonts w:ascii="Consolas" w:eastAsia="Times New Roman" w:hAnsi="Consolas" w:cs="Times New Roman"/>
+          <w:color w:val="C586C0"/>
+          <w:sz w:val="21"/>
+          <w:szCs w:val="21"/>
+        </w:rPr>
+        <w:t>if</w:t>
+      </w:r>
+      <w:proofErr w:type="spellEnd"/>
+      <w:r>
+        <w:rPr>
+          <w:rFonts w:ascii="Consolas" w:eastAsia="Times New Roman" w:hAnsi="Consolas" w:cs="Times New Roman"/>
+          <w:color w:val="D4D4D4"/>
+          <w:sz w:val="21"/>
+          <w:szCs w:val="21"/>
+        </w:rPr>
+        <w:t xml:space="preserve"> (</w:t>
+      </w:r>
+      <w:r>
+        <w:rPr>
+          <w:rFonts w:ascii="Consolas" w:eastAsia="Times New Roman" w:hAnsi="Consolas" w:cs="Times New Roman"/>
+          <w:color w:val="C9D1D9"/>
+          <w:sz w:val="21"/>
+          <w:szCs w:val="21"/>
+        </w:rPr>
+        <w:t>$</w:t>
+      </w:r>
+      <w:proofErr w:type="spellStart"/>
+      <w:r>
+        <w:rPr>
+          <w:rFonts w:ascii="Consolas" w:eastAsia="Times New Roman" w:hAnsi="Consolas" w:cs="Times New Roman"/>
+          <w:color w:val="C9D1D9"/>
+          <w:sz w:val="21"/>
+          <w:szCs w:val="21"/>
+        </w:rPr>
+        <w:t>conexion</w:t>
+      </w:r>
+      <w:proofErr w:type="spellEnd"/>
+      <w:r>
+        <w:rPr>
+          <w:rFonts w:ascii="Consolas" w:eastAsia="Times New Roman" w:hAnsi="Consolas" w:cs="Times New Roman"/>
+          <w:color w:val="D4D4D4"/>
+          <w:sz w:val="21"/>
+          <w:szCs w:val="21"/>
+        </w:rPr>
+        <w:t>-&gt;</w:t>
+      </w:r>
+      <w:proofErr w:type="spellStart"/>
+      <w:r>
+        <w:rPr>
+          <w:rFonts w:ascii="Consolas" w:eastAsia="Times New Roman" w:hAnsi="Consolas" w:cs="Times New Roman"/>
+          <w:color w:val="C9D1D9"/>
+          <w:sz w:val="21"/>
+          <w:szCs w:val="21"/>
+        </w:rPr>
+        <w:t>connect_error</w:t>
+      </w:r>
+      <w:proofErr w:type="spellEnd"/>
+      <w:r>
+        <w:rPr>
+          <w:rFonts w:ascii="Consolas" w:eastAsia="Times New Roman" w:hAnsi="Consolas" w:cs="Times New Roman"/>
+          <w:color w:val="D4D4D4"/>
+          <w:sz w:val="21"/>
+          <w:szCs w:val="21"/>
+        </w:rPr>
+        <w:t xml:space="preserve">){ </w:t>
+      </w:r>
+      <w:r>
+        <w:rPr>
+          <w:rFonts w:ascii="Consolas" w:eastAsia="Times New Roman" w:hAnsi="Consolas" w:cs="Times New Roman"/>
+          <w:color w:val="8B949E"/>
+          <w:sz w:val="21"/>
+          <w:szCs w:val="21"/>
+        </w:rPr>
+        <w:t xml:space="preserve">#Esta </w:t>
+      </w:r>
+      <w:proofErr w:type="spellStart"/>
+      <w:r>
+        <w:rPr>
+          <w:rFonts w:ascii="Consolas" w:eastAsia="Times New Roman" w:hAnsi="Consolas" w:cs="Times New Roman"/>
+          <w:color w:val="8B949E"/>
+          <w:sz w:val="21"/>
+          <w:szCs w:val="21"/>
+        </w:rPr>
+        <w:t>linea</w:t>
+      </w:r>
+      <w:proofErr w:type="spellEnd"/>
+      <w:r>
+        <w:rPr>
+          <w:rFonts w:ascii="Consolas" w:eastAsia="Times New Roman" w:hAnsi="Consolas" w:cs="Times New Roman"/>
+          <w:color w:val="8B949E"/>
+          <w:sz w:val="21"/>
+          <w:szCs w:val="21"/>
+        </w:rPr>
+        <w:t xml:space="preserve"> se utiliza para verificar si </w:t>
+      </w:r>
+      <w:proofErr w:type="spellStart"/>
+      <w:r>
+        <w:rPr>
+          <w:rFonts w:ascii="Consolas" w:eastAsia="Times New Roman" w:hAnsi="Consolas" w:cs="Times New Roman"/>
+          <w:color w:val="8B949E"/>
+          <w:sz w:val="21"/>
+          <w:szCs w:val="21"/>
+        </w:rPr>
+        <w:t>ocurrio</w:t>
+      </w:r>
+      <w:proofErr w:type="spellEnd"/>
+      <w:r>
+        <w:rPr>
+          <w:rFonts w:ascii="Consolas" w:eastAsia="Times New Roman" w:hAnsi="Consolas" w:cs="Times New Roman"/>
+          <w:color w:val="8B949E"/>
+          <w:sz w:val="21"/>
+          <w:szCs w:val="21"/>
+        </w:rPr>
+        <w:t xml:space="preserve"> </w:t>
+      </w:r>
+      <w:proofErr w:type="spellStart"/>
+      <w:r>
+        <w:rPr>
+          <w:rFonts w:ascii="Consolas" w:eastAsia="Times New Roman" w:hAnsi="Consolas" w:cs="Times New Roman"/>
+          <w:color w:val="8B949E"/>
+          <w:sz w:val="21"/>
+          <w:szCs w:val="21"/>
+        </w:rPr>
+        <w:t>algun</w:t>
+      </w:r>
+      <w:proofErr w:type="spellEnd"/>
+      <w:r>
+        <w:rPr>
+          <w:rFonts w:ascii="Consolas" w:eastAsia="Times New Roman" w:hAnsi="Consolas" w:cs="Times New Roman"/>
+          <w:color w:val="8B949E"/>
+          <w:sz w:val="21"/>
+          <w:szCs w:val="21"/>
+        </w:rPr>
+        <w:t xml:space="preserve"> error, por ejemplo que los datos que se obtienen de </w:t>
+      </w:r>
+      <w:proofErr w:type="spellStart"/>
+      <w:r>
+        <w:rPr>
+          <w:rFonts w:ascii="Consolas" w:eastAsia="Times New Roman" w:hAnsi="Consolas" w:cs="Times New Roman"/>
+          <w:color w:val="8B949E"/>
+          <w:sz w:val="21"/>
+          <w:szCs w:val="21"/>
+        </w:rPr>
+        <w:t>config</w:t>
+      </w:r>
+      <w:proofErr w:type="spellEnd"/>
+      <w:r>
+        <w:rPr>
+          <w:rFonts w:ascii="Consolas" w:eastAsia="Times New Roman" w:hAnsi="Consolas" w:cs="Times New Roman"/>
+          <w:color w:val="8B949E"/>
+          <w:sz w:val="21"/>
+          <w:szCs w:val="21"/>
+        </w:rPr>
+        <w:t xml:space="preserve"> sean incorrectos y </w:t>
+      </w:r>
+      <w:proofErr w:type="spellStart"/>
+      <w:r>
+        <w:rPr>
+          <w:rFonts w:ascii="Consolas" w:eastAsia="Times New Roman" w:hAnsi="Consolas" w:cs="Times New Roman"/>
+          <w:color w:val="8B949E"/>
+          <w:sz w:val="21"/>
+          <w:szCs w:val="21"/>
+        </w:rPr>
+        <w:t>connect_error</w:t>
+      </w:r>
+      <w:proofErr w:type="spellEnd"/>
+      <w:r>
+        <w:rPr>
+          <w:rFonts w:ascii="Consolas" w:eastAsia="Times New Roman" w:hAnsi="Consolas" w:cs="Times New Roman"/>
+          <w:color w:val="8B949E"/>
+          <w:sz w:val="21"/>
+          <w:szCs w:val="21"/>
+        </w:rPr>
+        <w:t xml:space="preserve"> guarda el mensaje de error que se produce.</w:t>
+      </w:r>
+    </w:p>
+    <w:p>
+      <w:pPr>
+        <w:shd w:val="clear" w:color="auto" w:fill="121314"/>
+        <w:spacing w:after="0" w:line="285" w:lineRule="atLeast"/>
+        <w:rPr>
+          <w:rFonts w:ascii="Consolas" w:eastAsia="Times New Roman" w:hAnsi="Consolas" w:cs="Times New Roman"/>
+          <w:color w:val="BBBEBF"/>
+          <w:sz w:val="21"/>
+          <w:szCs w:val="21"/>
+        </w:rPr>
+      </w:pPr>
+      <w:r>
+        <w:rPr>
+          <w:rFonts w:ascii="Consolas" w:eastAsia="Times New Roman" w:hAnsi="Consolas" w:cs="Times New Roman"/>
+          <w:color w:val="D4D4D4"/>
+          <w:sz w:val="21"/>
+          <w:szCs w:val="21"/>
+        </w:rPr>
+        <w:t xml:space="preserve">    </w:t>
+      </w:r>
+      <w:r>
+        <w:rPr>
+          <w:rFonts w:ascii="Consolas" w:eastAsia="Times New Roman" w:hAnsi="Consolas" w:cs="Times New Roman"/>
+          <w:color w:val="C586C0"/>
+          <w:sz w:val="21"/>
+          <w:szCs w:val="21"/>
+        </w:rPr>
+        <w:t>die</w:t>
+      </w:r>
+      <w:r>
+        <w:rPr>
+          <w:rFonts w:ascii="Consolas" w:eastAsia="Times New Roman" w:hAnsi="Consolas" w:cs="Times New Roman"/>
+          <w:color w:val="D4D4D4"/>
+          <w:sz w:val="21"/>
+          <w:szCs w:val="21"/>
+        </w:rPr>
+        <w:t>(</w:t>
+      </w:r>
+      <w:r>
+        <w:rPr>
+          <w:rFonts w:ascii="Consolas" w:eastAsia="Times New Roman" w:hAnsi="Consolas" w:cs="Times New Roman"/>
+          <w:color w:val="A5D6FF"/>
+          <w:sz w:val="21"/>
+          <w:szCs w:val="21"/>
+        </w:rPr>
+        <w:t xml:space="preserve">"Error de </w:t>
+      </w:r>
+      <w:proofErr w:type="spellStart"/>
+      <w:r>
+        <w:rPr>
+          <w:rFonts w:ascii="Consolas" w:eastAsia="Times New Roman" w:hAnsi="Consolas" w:cs="Times New Roman"/>
+          <w:color w:val="A5D6FF"/>
+          <w:sz w:val="21"/>
+          <w:szCs w:val="21"/>
+        </w:rPr>
+        <w:t>conexion</w:t>
+      </w:r>
+      <w:proofErr w:type="spellEnd"/>
+      <w:r>
+        <w:rPr>
+          <w:rFonts w:ascii="Consolas" w:eastAsia="Times New Roman" w:hAnsi="Consolas" w:cs="Times New Roman"/>
+          <w:color w:val="A5D6FF"/>
+          <w:sz w:val="21"/>
+          <w:szCs w:val="21"/>
+        </w:rPr>
+        <w:t>: "</w:t>
+      </w:r>
+      <w:r>
+        <w:rPr>
+          <w:rFonts w:ascii="Consolas" w:eastAsia="Times New Roman" w:hAnsi="Consolas" w:cs="Times New Roman"/>
+          <w:color w:val="D4D4D4"/>
+          <w:sz w:val="21"/>
+          <w:szCs w:val="21"/>
+        </w:rPr>
+        <w:t xml:space="preserve"> . </w:t>
+      </w:r>
+      <w:r>
+        <w:rPr>
+          <w:rFonts w:ascii="Consolas" w:eastAsia="Times New Roman" w:hAnsi="Consolas" w:cs="Times New Roman"/>
+          <w:color w:val="C9D1D9"/>
+          <w:sz w:val="21"/>
+          <w:szCs w:val="21"/>
+        </w:rPr>
+        <w:t>$</w:t>
+      </w:r>
+      <w:proofErr w:type="spellStart"/>
+      <w:r>
+        <w:rPr>
+          <w:rFonts w:ascii="Consolas" w:eastAsia="Times New Roman" w:hAnsi="Consolas" w:cs="Times New Roman"/>
+          <w:color w:val="C9D1D9"/>
+          <w:sz w:val="21"/>
+          <w:szCs w:val="21"/>
+        </w:rPr>
+        <w:t>conexion</w:t>
+      </w:r>
+      <w:proofErr w:type="spellEnd"/>
+      <w:r>
+        <w:rPr>
+          <w:rFonts w:ascii="Consolas" w:eastAsia="Times New Roman" w:hAnsi="Consolas" w:cs="Times New Roman"/>
+          <w:color w:val="D4D4D4"/>
+          <w:sz w:val="21"/>
+          <w:szCs w:val="21"/>
+        </w:rPr>
+        <w:t>-&gt;</w:t>
+      </w:r>
+      <w:proofErr w:type="spellStart"/>
+      <w:r>
+        <w:rPr>
+          <w:rFonts w:ascii="Consolas" w:eastAsia="Times New Roman" w:hAnsi="Consolas" w:cs="Times New Roman"/>
+          <w:color w:val="C9D1D9"/>
+          <w:sz w:val="21"/>
+          <w:szCs w:val="21"/>
+        </w:rPr>
+        <w:t>connect_error</w:t>
+      </w:r>
+      <w:proofErr w:type="spellEnd"/>
+      <w:r>
+        <w:rPr>
+          <w:rFonts w:ascii="Consolas" w:eastAsia="Times New Roman" w:hAnsi="Consolas" w:cs="Times New Roman"/>
+          <w:color w:val="D4D4D4"/>
+          <w:sz w:val="21"/>
+          <w:szCs w:val="21"/>
+        </w:rPr>
+        <w:t xml:space="preserve">); </w:t>
+      </w:r>
+      <w:r>
+        <w:rPr>
+          <w:rFonts w:ascii="Consolas" w:eastAsia="Times New Roman" w:hAnsi="Consolas" w:cs="Times New Roman"/>
+          <w:color w:val="8B949E"/>
+          <w:sz w:val="21"/>
+          <w:szCs w:val="21"/>
+        </w:rPr>
+        <w:t xml:space="preserve">#Esta </w:t>
+      </w:r>
+      <w:proofErr w:type="spellStart"/>
+      <w:r>
+        <w:rPr>
+          <w:rFonts w:ascii="Consolas" w:eastAsia="Times New Roman" w:hAnsi="Consolas" w:cs="Times New Roman"/>
+          <w:color w:val="8B949E"/>
+          <w:sz w:val="21"/>
+          <w:szCs w:val="21"/>
+        </w:rPr>
+        <w:t>linea</w:t>
+      </w:r>
+      <w:proofErr w:type="spellEnd"/>
+      <w:r>
+        <w:rPr>
+          <w:rFonts w:ascii="Consolas" w:eastAsia="Times New Roman" w:hAnsi="Consolas" w:cs="Times New Roman"/>
+          <w:color w:val="8B949E"/>
+          <w:sz w:val="21"/>
+          <w:szCs w:val="21"/>
+        </w:rPr>
+        <w:t xml:space="preserve"> se utiliza para detener el programa y mostrar un mensaje si hubo </w:t>
+      </w:r>
+      <w:proofErr w:type="spellStart"/>
+      <w:r>
+        <w:rPr>
+          <w:rFonts w:ascii="Consolas" w:eastAsia="Times New Roman" w:hAnsi="Consolas" w:cs="Times New Roman"/>
+          <w:color w:val="8B949E"/>
+          <w:sz w:val="21"/>
+          <w:szCs w:val="21"/>
+        </w:rPr>
+        <w:t>algun</w:t>
+      </w:r>
+      <w:proofErr w:type="spellEnd"/>
+      <w:r>
+        <w:rPr>
+          <w:rFonts w:ascii="Consolas" w:eastAsia="Times New Roman" w:hAnsi="Consolas" w:cs="Times New Roman"/>
+          <w:color w:val="8B949E"/>
+          <w:sz w:val="21"/>
+          <w:szCs w:val="21"/>
+        </w:rPr>
+        <w:t xml:space="preserve"> error, </w:t>
+      </w:r>
+      <w:proofErr w:type="spellStart"/>
+      <w:r>
+        <w:rPr>
+          <w:rFonts w:ascii="Consolas" w:eastAsia="Times New Roman" w:hAnsi="Consolas" w:cs="Times New Roman"/>
+          <w:color w:val="8B949E"/>
+          <w:sz w:val="21"/>
+          <w:szCs w:val="21"/>
+        </w:rPr>
+        <w:t>ademas</w:t>
+      </w:r>
+      <w:proofErr w:type="spellEnd"/>
+      <w:r>
+        <w:rPr>
+          <w:rFonts w:ascii="Consolas" w:eastAsia="Times New Roman" w:hAnsi="Consolas" w:cs="Times New Roman"/>
+          <w:color w:val="8B949E"/>
+          <w:sz w:val="21"/>
+          <w:szCs w:val="21"/>
+        </w:rPr>
+        <w:t xml:space="preserve"> de que gracias a esto el resto del </w:t>
+      </w:r>
+      <w:proofErr w:type="spellStart"/>
+      <w:r>
+        <w:rPr>
+          <w:rFonts w:ascii="Consolas" w:eastAsia="Times New Roman" w:hAnsi="Consolas" w:cs="Times New Roman"/>
+          <w:color w:val="8B949E"/>
+          <w:sz w:val="21"/>
+          <w:szCs w:val="21"/>
+        </w:rPr>
+        <w:t>codigo</w:t>
+      </w:r>
+      <w:proofErr w:type="spellEnd"/>
+      <w:r>
+        <w:rPr>
+          <w:rFonts w:ascii="Consolas" w:eastAsia="Times New Roman" w:hAnsi="Consolas" w:cs="Times New Roman"/>
+          <w:color w:val="8B949E"/>
+          <w:sz w:val="21"/>
+          <w:szCs w:val="21"/>
+        </w:rPr>
+        <w:t xml:space="preserve"> ya no se </w:t>
+      </w:r>
+      <w:proofErr w:type="spellStart"/>
+      <w:r>
+        <w:rPr>
+          <w:rFonts w:ascii="Consolas" w:eastAsia="Times New Roman" w:hAnsi="Consolas" w:cs="Times New Roman"/>
+          <w:color w:val="8B949E"/>
+          <w:sz w:val="21"/>
+          <w:szCs w:val="21"/>
+        </w:rPr>
+        <w:t>ejcuta</w:t>
+      </w:r>
+      <w:proofErr w:type="spellEnd"/>
+      <w:r>
+        <w:rPr>
+          <w:rFonts w:ascii="Consolas" w:eastAsia="Times New Roman" w:hAnsi="Consolas" w:cs="Times New Roman"/>
+          <w:color w:val="8B949E"/>
+          <w:sz w:val="21"/>
+          <w:szCs w:val="21"/>
+        </w:rPr>
+        <w:t xml:space="preserve">. </w:t>
+      </w:r>
+    </w:p>
+    <w:p>
+      <w:pPr>
+        <w:shd w:val="clear" w:color="auto" w:fill="121314"/>
+        <w:spacing w:after="0" w:line="285" w:lineRule="atLeast"/>
+        <w:rPr>
+          <w:rFonts w:ascii="Consolas" w:eastAsia="Times New Roman" w:hAnsi="Consolas" w:cs="Times New Roman"/>
+          <w:color w:val="BBBEBF"/>
+          <w:sz w:val="21"/>
+          <w:szCs w:val="21"/>
+        </w:rPr>
+      </w:pPr>
+      <w:r>
+        <w:rPr>
+          <w:rFonts w:ascii="Consolas" w:eastAsia="Times New Roman" w:hAnsi="Consolas" w:cs="Times New Roman"/>
+          <w:color w:val="D4D4D4"/>
+          <w:sz w:val="21"/>
+          <w:szCs w:val="21"/>
+        </w:rPr>
+        <w:t>}</w:t>
+      </w:r>
+    </w:p>
+    <w:p>
+      <w:pPr>
+        <w:shd w:val="clear" w:color="auto" w:fill="121314"/>
+        <w:spacing w:after="0" w:line="285" w:lineRule="atLeast"/>
+        <w:rPr>
+          <w:rFonts w:ascii="Consolas" w:eastAsia="Times New Roman" w:hAnsi="Consolas" w:cs="Times New Roman"/>
+          <w:color w:val="BBBEBF"/>
+          <w:sz w:val="21"/>
+          <w:szCs w:val="21"/>
+        </w:rPr>
+      </w:pPr>
+    </w:p>
+    <w:p>
+      <w:pPr>
+        <w:shd w:val="clear" w:color="auto" w:fill="121314"/>
+        <w:spacing w:after="0" w:line="285" w:lineRule="atLeast"/>
+        <w:rPr>
+          <w:rFonts w:ascii="Consolas" w:eastAsia="Times New Roman" w:hAnsi="Consolas" w:cs="Times New Roman"/>
+          <w:color w:val="BBBEBF"/>
+          <w:sz w:val="21"/>
+          <w:szCs w:val="21"/>
+        </w:rPr>
+      </w:pPr>
+      <w:r>
+        <w:rPr>
+          <w:rFonts w:ascii="Consolas" w:eastAsia="Times New Roman" w:hAnsi="Consolas" w:cs="Times New Roman"/>
+          <w:color w:val="DCDCAA"/>
+          <w:sz w:val="21"/>
+          <w:szCs w:val="21"/>
+        </w:rPr>
+        <w:t>echo</w:t>
+      </w:r>
+      <w:r>
+        <w:rPr>
+          <w:rFonts w:ascii="Consolas" w:eastAsia="Times New Roman" w:hAnsi="Consolas" w:cs="Times New Roman"/>
+          <w:color w:val="D4D4D4"/>
+          <w:sz w:val="21"/>
+          <w:szCs w:val="21"/>
+        </w:rPr>
+        <w:t xml:space="preserve"> </w:t>
+      </w:r>
+      <w:r>
+        <w:rPr>
+          <w:rFonts w:ascii="Consolas" w:eastAsia="Times New Roman" w:hAnsi="Consolas" w:cs="Times New Roman"/>
+          <w:color w:val="A5D6FF"/>
+          <w:sz w:val="21"/>
+          <w:szCs w:val="21"/>
+        </w:rPr>
+        <w:t>"</w:t>
+      </w:r>
+      <w:proofErr w:type="spellStart"/>
+      <w:r>
+        <w:rPr>
+          <w:rFonts w:ascii="Consolas" w:eastAsia="Times New Roman" w:hAnsi="Consolas" w:cs="Times New Roman"/>
+          <w:color w:val="A5D6FF"/>
+          <w:sz w:val="21"/>
+          <w:szCs w:val="21"/>
+        </w:rPr>
+        <w:t>Conexion</w:t>
+      </w:r>
+      <w:proofErr w:type="spellEnd"/>
+      <w:r>
+        <w:rPr>
+          <w:rFonts w:ascii="Consolas" w:eastAsia="Times New Roman" w:hAnsi="Consolas" w:cs="Times New Roman"/>
+          <w:color w:val="A5D6FF"/>
+          <w:sz w:val="21"/>
+          <w:szCs w:val="21"/>
+        </w:rPr>
+        <w:t xml:space="preserve"> al servidor exitosa. "</w:t>
+      </w:r>
+      <w:r>
+        <w:rPr>
+          <w:rFonts w:ascii="Consolas" w:eastAsia="Times New Roman" w:hAnsi="Consolas" w:cs="Times New Roman"/>
+          <w:color w:val="D4D4D4"/>
+          <w:sz w:val="21"/>
+          <w:szCs w:val="21"/>
+        </w:rPr>
+        <w:t xml:space="preserve">; </w:t>
+      </w:r>
+      <w:r>
+        <w:rPr>
+          <w:rFonts w:ascii="Consolas" w:eastAsia="Times New Roman" w:hAnsi="Consolas" w:cs="Times New Roman"/>
+          <w:color w:val="8B949E"/>
+          <w:sz w:val="21"/>
+          <w:szCs w:val="21"/>
+        </w:rPr>
+        <w:t xml:space="preserve">#si la </w:t>
+      </w:r>
+      <w:proofErr w:type="spellStart"/>
+      <w:r>
+        <w:rPr>
+          <w:rFonts w:ascii="Consolas" w:eastAsia="Times New Roman" w:hAnsi="Consolas" w:cs="Times New Roman"/>
+          <w:color w:val="8B949E"/>
+          <w:sz w:val="21"/>
+          <w:szCs w:val="21"/>
+        </w:rPr>
+        <w:t>conexion</w:t>
+      </w:r>
+      <w:proofErr w:type="spellEnd"/>
+      <w:r>
+        <w:rPr>
+          <w:rFonts w:ascii="Consolas" w:eastAsia="Times New Roman" w:hAnsi="Consolas" w:cs="Times New Roman"/>
+          <w:color w:val="8B949E"/>
+          <w:sz w:val="21"/>
+          <w:szCs w:val="21"/>
+        </w:rPr>
+        <w:t xml:space="preserve"> se </w:t>
+      </w:r>
+      <w:proofErr w:type="spellStart"/>
+      <w:r>
+        <w:rPr>
+          <w:rFonts w:ascii="Consolas" w:eastAsia="Times New Roman" w:hAnsi="Consolas" w:cs="Times New Roman"/>
+          <w:color w:val="8B949E"/>
+          <w:sz w:val="21"/>
+          <w:szCs w:val="21"/>
+        </w:rPr>
+        <w:t>realizo</w:t>
+      </w:r>
+      <w:proofErr w:type="spellEnd"/>
+      <w:r>
+        <w:rPr>
+          <w:rFonts w:ascii="Consolas" w:eastAsia="Times New Roman" w:hAnsi="Consolas" w:cs="Times New Roman"/>
+          <w:color w:val="8B949E"/>
+          <w:sz w:val="21"/>
+          <w:szCs w:val="21"/>
+        </w:rPr>
+        <w:t xml:space="preserve"> de forma exitosa se muestra el mensaje de este </w:t>
+      </w:r>
+      <w:proofErr w:type="spellStart"/>
+      <w:r>
+        <w:rPr>
+          <w:rFonts w:ascii="Consolas" w:eastAsia="Times New Roman" w:hAnsi="Consolas" w:cs="Times New Roman"/>
+          <w:color w:val="8B949E"/>
+          <w:sz w:val="21"/>
+          <w:szCs w:val="21"/>
+        </w:rPr>
+        <w:t>echo</w:t>
+      </w:r>
+      <w:proofErr w:type="spellEnd"/>
+      <w:r>
+        <w:rPr>
+          <w:rFonts w:ascii="Consolas" w:eastAsia="Times New Roman" w:hAnsi="Consolas" w:cs="Times New Roman"/>
+          <w:color w:val="8B949E"/>
+          <w:sz w:val="21"/>
+          <w:szCs w:val="21"/>
+        </w:rPr>
+        <w:t xml:space="preserve"> para decirle al usuario que el proceso es correcto</w:t>
+      </w:r>
+    </w:p>
+    <w:p>
+      <w:pPr>
+        <w:shd w:val="clear" w:color="auto" w:fill="121314"/>
+        <w:spacing w:after="0" w:line="285" w:lineRule="atLeast"/>
+        <w:rPr>
+          <w:rFonts w:ascii="Consolas" w:eastAsia="Times New Roman" w:hAnsi="Consolas" w:cs="Times New Roman"/>
+          <w:color w:val="BBBEBF"/>
+          <w:sz w:val="21"/>
+          <w:szCs w:val="21"/>
+        </w:rPr>
+      </w:pPr>
+      <w:r>
+        <w:rPr>
+          <w:rFonts w:ascii="Consolas" w:eastAsia="Times New Roman" w:hAnsi="Consolas" w:cs="Times New Roman"/>
+          <w:color w:val="8B949E"/>
+          <w:sz w:val="21"/>
+          <w:szCs w:val="21"/>
+        </w:rPr>
+        <w:t>#mysql es el gestor de base de datos</w:t>
+      </w:r>
+    </w:p>
+    <w:p>
+      <w:pPr>
+        <w:shd w:val="clear" w:color="auto" w:fill="121314"/>
+        <w:spacing w:after="0" w:line="285" w:lineRule="atLeast"/>
+        <w:rPr>
+          <w:rFonts w:ascii="Consolas" w:eastAsia="Times New Roman" w:hAnsi="Consolas" w:cs="Times New Roman"/>
+          <w:color w:val="BBBEBF"/>
+          <w:sz w:val="21"/>
+          <w:szCs w:val="21"/>
+        </w:rPr>
+      </w:pPr>
+      <w:r>
+        <w:rPr>
+          <w:rFonts w:ascii="Consolas" w:eastAsia="Times New Roman" w:hAnsi="Consolas" w:cs="Times New Roman"/>
+          <w:color w:val="8B949E"/>
+          <w:sz w:val="21"/>
+          <w:szCs w:val="21"/>
+        </w:rPr>
+        <w:t xml:space="preserve">#que representa cada variable </w:t>
+      </w:r>
+    </w:p>
+    <w:p>
+      <w:pPr>
+        <w:shd w:val="clear" w:color="auto" w:fill="121314"/>
+        <w:spacing w:after="0" w:line="285" w:lineRule="atLeast"/>
+        <w:rPr>
+          <w:rFonts w:ascii="Consolas" w:eastAsia="Times New Roman" w:hAnsi="Consolas" w:cs="Times New Roman"/>
+          <w:color w:val="BBBEBF"/>
+          <w:sz w:val="21"/>
+          <w:szCs w:val="21"/>
+        </w:rPr>
+      </w:pPr>
+      <w:r>
+        <w:rPr>
+          <w:rFonts w:ascii="Consolas" w:eastAsia="Times New Roman" w:hAnsi="Consolas" w:cs="Times New Roman"/>
+          <w:color w:val="8B949E"/>
+          <w:sz w:val="21"/>
+          <w:szCs w:val="21"/>
+        </w:rPr>
+        <w:t xml:space="preserve">#$host: es la </w:t>
+      </w:r>
+      <w:proofErr w:type="spellStart"/>
+      <w:r>
+        <w:rPr>
+          <w:rFonts w:ascii="Consolas" w:eastAsia="Times New Roman" w:hAnsi="Consolas" w:cs="Times New Roman"/>
+          <w:color w:val="8B949E"/>
+          <w:sz w:val="21"/>
+          <w:szCs w:val="21"/>
+        </w:rPr>
+        <w:t>direccion</w:t>
+      </w:r>
+      <w:proofErr w:type="spellEnd"/>
+      <w:r>
+        <w:rPr>
+          <w:rFonts w:ascii="Consolas" w:eastAsia="Times New Roman" w:hAnsi="Consolas" w:cs="Times New Roman"/>
+          <w:color w:val="8B949E"/>
+          <w:sz w:val="21"/>
+          <w:szCs w:val="21"/>
+        </w:rPr>
+        <w:t xml:space="preserve"> del servidor</w:t>
+      </w:r>
+    </w:p>
+    <w:p>
+      <w:pPr>
+        <w:shd w:val="clear" w:color="auto" w:fill="121314"/>
+        <w:spacing w:after="0" w:line="285" w:lineRule="atLeast"/>
+        <w:rPr>
+          <w:rFonts w:ascii="Consolas" w:eastAsia="Times New Roman" w:hAnsi="Consolas" w:cs="Times New Roman"/>
+          <w:color w:val="BBBEBF"/>
+          <w:sz w:val="21"/>
+          <w:szCs w:val="21"/>
+        </w:rPr>
+      </w:pPr>
+      <w:r>
+        <w:rPr>
+          <w:rFonts w:ascii="Consolas" w:eastAsia="Times New Roman" w:hAnsi="Consolas" w:cs="Times New Roman"/>
+          <w:color w:val="8B949E"/>
+          <w:sz w:val="21"/>
+          <w:szCs w:val="21"/>
+        </w:rPr>
+        <w:lastRenderedPageBreak/>
+        <w:t>#$user: representa el nombre de usuario con el que se intenta acceder</w:t>
+      </w:r>
+    </w:p>
+    <w:p>
+      <w:pPr>
+        <w:shd w:val="clear" w:color="auto" w:fill="121314"/>
+        <w:spacing w:after="0" w:line="285" w:lineRule="atLeast"/>
+        <w:rPr>
+          <w:rFonts w:ascii="Consolas" w:eastAsia="Times New Roman" w:hAnsi="Consolas" w:cs="Times New Roman"/>
+          <w:color w:val="BBBEBF"/>
+          <w:sz w:val="21"/>
+          <w:szCs w:val="21"/>
+        </w:rPr>
+      </w:pPr>
+      <w:r>
+        <w:rPr>
+          <w:rFonts w:ascii="Consolas" w:eastAsia="Times New Roman" w:hAnsi="Consolas" w:cs="Times New Roman"/>
+          <w:color w:val="8B949E"/>
+          <w:sz w:val="21"/>
+          <w:szCs w:val="21"/>
+        </w:rPr>
+        <w:t>#$pass: es la contraseña del usuario</w:t>
+      </w:r>
+    </w:p>
+    <w:p>
+      <w:pPr>
+        <w:shd w:val="clear" w:color="auto" w:fill="121314"/>
+        <w:spacing w:after="0" w:line="285" w:lineRule="atLeast"/>
+        <w:rPr>
+          <w:rFonts w:ascii="Consolas" w:eastAsia="Times New Roman" w:hAnsi="Consolas" w:cs="Times New Roman"/>
+          <w:color w:val="BBBEBF"/>
+          <w:sz w:val="21"/>
+          <w:szCs w:val="21"/>
+        </w:rPr>
+      </w:pPr>
+      <w:r>
+        <w:rPr>
+          <w:rFonts w:ascii="Consolas" w:eastAsia="Times New Roman" w:hAnsi="Consolas" w:cs="Times New Roman"/>
+          <w:color w:val="8B949E"/>
+          <w:sz w:val="21"/>
+          <w:szCs w:val="21"/>
+        </w:rPr>
+        <w:t xml:space="preserve">#Todos estos datos se toman del archivo de </w:t>
+      </w:r>
+      <w:proofErr w:type="spellStart"/>
+      <w:r>
+        <w:rPr>
+          <w:rFonts w:ascii="Consolas" w:eastAsia="Times New Roman" w:hAnsi="Consolas" w:cs="Times New Roman"/>
+          <w:color w:val="8B949E"/>
+          <w:sz w:val="21"/>
+          <w:szCs w:val="21"/>
+        </w:rPr>
+        <w:t>config.php</w:t>
+      </w:r>
+      <w:proofErr w:type="spellEnd"/>
+      <w:r>
+        <w:rPr>
+          <w:rFonts w:ascii="Consolas" w:eastAsia="Times New Roman" w:hAnsi="Consolas" w:cs="Times New Roman"/>
+          <w:color w:val="8B949E"/>
+          <w:sz w:val="21"/>
+          <w:szCs w:val="21"/>
+        </w:rPr>
+        <w:t xml:space="preserve"> cuando se carga utilizando el </w:t>
+      </w:r>
+      <w:proofErr w:type="spellStart"/>
+      <w:r>
+        <w:rPr>
+          <w:rFonts w:ascii="Consolas" w:eastAsia="Times New Roman" w:hAnsi="Consolas" w:cs="Times New Roman"/>
+          <w:color w:val="8B949E"/>
+          <w:sz w:val="21"/>
+          <w:szCs w:val="21"/>
+        </w:rPr>
+        <w:t>require_once</w:t>
+      </w:r>
+      <w:proofErr w:type="spellEnd"/>
+    </w:p>
+    <w:p>
+      <w:pPr>
+        <w:shd w:val="clear" w:color="auto" w:fill="121314"/>
+        <w:spacing w:after="0" w:line="285" w:lineRule="atLeast"/>
+        <w:rPr>
+          <w:rFonts w:ascii="Consolas" w:eastAsia="Times New Roman" w:hAnsi="Consolas" w:cs="Times New Roman"/>
+          <w:color w:val="BBBEBF"/>
+          <w:sz w:val="21"/>
+          <w:szCs w:val="21"/>
+        </w:rPr>
+      </w:pPr>
+      <w:r>
+        <w:rPr>
+          <w:rFonts w:ascii="Consolas" w:eastAsia="Times New Roman" w:hAnsi="Consolas" w:cs="Times New Roman"/>
+          <w:color w:val="569CD6"/>
+          <w:sz w:val="21"/>
+          <w:szCs w:val="21"/>
+        </w:rPr>
+        <w:t>?&gt;</w:t>
+      </w:r>
+    </w:p>
+    <w:p>
+      <w:pPr>
+        <w:rPr>
+          <w:b/>
+          <w:bCs/>
+        </w:rPr>
+      </w:pPr>
+    </w:p>
+    <w:p>
+      <w:pPr>
+        <w:rPr>
+          <w:b/>
+          <w:bCs/>
+        </w:rPr>
+      </w:pPr>
+      <w:r>
+        <w:rPr>
+          <w:b/>
+          <w:bCs/>
+        </w:rPr>
         <w:t>Evidencias fotográficas:</w:t>
       </w:r>
     </w:p>
     <w:p>
-      <w:r>
+      <w:pPr>
+        <w:jc w:val="center"/>
+      </w:pPr>
+      <w:r>
+        <w:rPr>
+          <w:noProof/>
+        </w:rPr>
         <w:drawing>
-          <wp:inline distT="0" distB="0" distL="0" distR="0" wp14:anchorId="56B573B0" wp14:editId="30D3163F">
-            <wp:extent cx="3519577" cy="1755806"/>
-            <wp:effectExtent l="0" t="0" r="5080" b="0"/>
+          <wp:inline distT="0" distB="0" distL="0" distR="0" wp14:anchorId="56B573B0" wp14:editId="7F68227F">
+            <wp:extent cx="4207128" cy="828000"/>
+            <wp:effectExtent l="0" t="0" r="3175" b="0"/>
             <wp:docPr id="6" name="Imagen 6"/>
             <wp:cNvGraphicFramePr>
               <a:graphicFrameLocks xmlns:a="http://schemas.openxmlformats.org/drawingml/2006/main" noChangeAspect="1"/>
@@ -1057,20 +2423,27 @@
                     <pic:cNvPr id="1" name=""/>
                     <pic:cNvPicPr/>
                   </pic:nvPicPr>
-                  <pic:blipFill>
-                    <a:blip r:embed="rId8"/>
-                    <a:stretch>
-                      <a:fillRect/>
-                    </a:stretch>
+                  <pic:blipFill rotWithShape="1">
+                    <a:blip r:embed="rId9"/>
+                    <a:srcRect t="-1" r="64752" b="86095"/>
+                    <a:stretch/>
                   </pic:blipFill>
-                  <pic:spPr>
+                  <pic:spPr bwMode="auto">
                     <a:xfrm>
                       <a:off x="0" y="0"/>
-                      <a:ext cx="3525967" cy="1758994"/>
+                      <a:ext cx="4207128" cy="828000"/>
                     </a:xfrm>
                     <a:prstGeom prst="rect">
                       <a:avLst/>
                     </a:prstGeom>
+                    <a:ln>
+                      <a:noFill/>
+                    </a:ln>
+                    <a:extLst>
+                      <a:ext uri="{53640926-AAD7-44D8-BBD7-CCE9431645EC}">
+                        <a14:shadowObscured xmlns:a14="http://schemas.microsoft.com/office/drawing/2010/main"/>
+                      </a:ext>
+                    </a:extLst>
                   </pic:spPr>
                 </pic:pic>
               </a:graphicData>
@@ -1081,15 +2454,40 @@
     </w:p>
     <w:p>
       <w:r>
-        <w:t>Conexión exitosa y creación de la base de datos</w:t>
-      </w:r>
-    </w:p>
-    <w:p>
-      <w:r>
+        <w:t>Imagen 1: El recorte de pantalla muestra la c</w:t>
+      </w:r>
+      <w:r>
+        <w:t>onexión y creación de la base de datos</w:t>
+      </w:r>
+      <w:r>
+        <w:t xml:space="preserve"> de forma </w:t>
+      </w:r>
+      <w:r>
+        <w:t>exitosa</w:t>
+      </w:r>
+      <w:r>
+        <w:t>.</w:t>
+      </w:r>
+    </w:p>
+    <w:p>
+      <w:pPr>
+        <w:rPr>
+          <w:noProof/>
+        </w:rPr>
+      </w:pPr>
+    </w:p>
+    <w:p>
+      <w:pPr>
+        <w:jc w:val="center"/>
+      </w:pPr>
+      <w:r>
+        <w:rPr>
+          <w:noProof/>
+        </w:rPr>
         <w:drawing>
-          <wp:inline distT="0" distB="0" distL="0" distR="0" wp14:anchorId="436F423F" wp14:editId="796138FB">
-            <wp:extent cx="3832381" cy="1577963"/>
-            <wp:effectExtent l="0" t="0" r="0" b="3810"/>
+          <wp:inline distT="0" distB="0" distL="0" distR="0" wp14:anchorId="436F423F" wp14:editId="7F141E5C">
+            <wp:extent cx="3472067" cy="828000"/>
+            <wp:effectExtent l="0" t="0" r="0" b="0"/>
             <wp:docPr id="8" name="Imagen 8"/>
             <wp:cNvGraphicFramePr>
               <a:graphicFrameLocks xmlns:a="http://schemas.openxmlformats.org/drawingml/2006/main" noChangeAspect="1"/>
@@ -1101,20 +2499,27 @@
                     <pic:cNvPr id="1" name=""/>
                     <pic:cNvPicPr/>
                   </pic:nvPicPr>
-                  <pic:blipFill>
-                    <a:blip r:embed="rId9"/>
-                    <a:stretch>
-                      <a:fillRect/>
-                    </a:stretch>
+                  <pic:blipFill rotWithShape="1">
+                    <a:blip r:embed="rId10"/>
+                    <a:srcRect r="72705" b="84190"/>
+                    <a:stretch/>
                   </pic:blipFill>
-                  <pic:spPr>
+                  <pic:spPr bwMode="auto">
                     <a:xfrm>
                       <a:off x="0" y="0"/>
-                      <a:ext cx="3859438" cy="1589103"/>
+                      <a:ext cx="3472067" cy="828000"/>
                     </a:xfrm>
                     <a:prstGeom prst="rect">
                       <a:avLst/>
                     </a:prstGeom>
+                    <a:ln>
+                      <a:noFill/>
+                    </a:ln>
+                    <a:extLst>
+                      <a:ext uri="{53640926-AAD7-44D8-BBD7-CCE9431645EC}">
+                        <a14:shadowObscured xmlns:a14="http://schemas.microsoft.com/office/drawing/2010/main"/>
+                      </a:ext>
+                    </a:extLst>
                   </pic:spPr>
                 </pic:pic>
               </a:graphicData>
@@ -1125,15 +2530,34 @@
     </w:p>
     <w:p>
       <w:r>
+        <w:t xml:space="preserve">Imagen 2: la fotografía muestra el mensaje que se envía al realizar la </w:t>
+      </w:r>
+      <w:r>
         <w:t xml:space="preserve">Creación de la tabla </w:t>
       </w:r>
-    </w:p>
-    <w:p>
-      <w:r>
+      <w:r>
+        <w:t>de manera exitosa.</w:t>
+      </w:r>
+    </w:p>
+    <w:p>
+      <w:pPr>
+        <w:rPr>
+          <w:noProof/>
+        </w:rPr>
+      </w:pPr>
+    </w:p>
+    <w:p>
+      <w:pPr>
+        <w:jc w:val="center"/>
+      </w:pPr>
+      <w:r>
+        <w:rPr>
+          <w:noProof/>
+        </w:rPr>
         <w:drawing>
-          <wp:inline distT="0" distB="0" distL="0" distR="0" wp14:anchorId="7CA6F366" wp14:editId="7B2F7359">
-            <wp:extent cx="5612130" cy="1512570"/>
-            <wp:effectExtent l="0" t="0" r="7620" b="0"/>
+          <wp:inline distT="0" distB="0" distL="0" distR="0" wp14:anchorId="7CA6F366" wp14:editId="724B0BFD">
+            <wp:extent cx="3344046" cy="828000"/>
+            <wp:effectExtent l="0" t="0" r="0" b="0"/>
             <wp:docPr id="9" name="Imagen 9"/>
             <wp:cNvGraphicFramePr>
               <a:graphicFrameLocks xmlns:a="http://schemas.openxmlformats.org/drawingml/2006/main" noChangeAspect="1"/>
@@ -1145,20 +2569,27 @@
                     <pic:cNvPr id="1" name=""/>
                     <pic:cNvPicPr/>
                   </pic:nvPicPr>
-                  <pic:blipFill>
-                    <a:blip r:embed="rId10"/>
-                    <a:stretch>
-                      <a:fillRect/>
-                    </a:stretch>
+                  <pic:blipFill rotWithShape="1">
+                    <a:blip r:embed="rId11"/>
+                    <a:srcRect r="70459" b="72861"/>
+                    <a:stretch/>
                   </pic:blipFill>
-                  <pic:spPr>
+                  <pic:spPr bwMode="auto">
                     <a:xfrm>
                       <a:off x="0" y="0"/>
-                      <a:ext cx="5612130" cy="1512570"/>
+                      <a:ext cx="3344046" cy="828000"/>
                     </a:xfrm>
                     <a:prstGeom prst="rect">
                       <a:avLst/>
                     </a:prstGeom>
+                    <a:ln>
+                      <a:noFill/>
+                    </a:ln>
+                    <a:extLst>
+                      <a:ext uri="{53640926-AAD7-44D8-BBD7-CCE9431645EC}">
+                        <a14:shadowObscured xmlns:a14="http://schemas.microsoft.com/office/drawing/2010/main"/>
+                      </a:ext>
+                    </a:extLst>
                   </pic:spPr>
                 </pic:pic>
               </a:graphicData>
@@ -1169,16 +2600,40 @@
     </w:p>
     <w:p>
       <w:r>
-        <w:t>Insertar registro</w:t>
-      </w:r>
-    </w:p>
-    <w:p>
-      <w:r>
-        <w:lastRenderedPageBreak/>
+        <w:t>Imagen 3: en esta imagen se puede apreciar el mensaje que se muestra cuando se i</w:t>
+      </w:r>
+      <w:r>
+        <w:t>nserta</w:t>
+      </w:r>
+      <w:r>
+        <w:t xml:space="preserve"> un</w:t>
+      </w:r>
+      <w:r>
+        <w:t xml:space="preserve"> registro</w:t>
+      </w:r>
+      <w:r>
+        <w:t xml:space="preserve"> de forma exitosa.</w:t>
+      </w:r>
+    </w:p>
+    <w:p>
+      <w:pPr>
+        <w:rPr>
+          <w:noProof/>
+        </w:rPr>
+      </w:pPr>
+    </w:p>
+    <w:p>
+      <w:pPr>
+        <w:jc w:val="center"/>
+      </w:pPr>
+      <w:r>
+        <w:rPr>
+          <w:noProof/>
+        </w:rPr>
         <w:drawing>
-          <wp:inline distT="0" distB="0" distL="0" distR="0" wp14:anchorId="3F8D8C5D" wp14:editId="31D7A6A8">
-            <wp:extent cx="5612130" cy="1113790"/>
-            <wp:effectExtent l="0" t="0" r="7620" b="0"/>
+          <wp:inline distT="0" distB="0" distL="0" distR="0" wp14:anchorId="3F8D8C5D" wp14:editId="56A2825B">
+            <wp:extent cx="2552131" cy="1122174"/>
+            <wp:effectExtent l="0" t="0" r="635" b="1905"/>
             <wp:docPr id="10" name="Imagen 10"/>
             <wp:cNvGraphicFramePr>
               <a:graphicFrameLocks xmlns:a="http://schemas.openxmlformats.org/drawingml/2006/main" noChangeAspect="1"/>
@@ -1190,20 +2645,27 @@
                     <pic:cNvPr id="1" name=""/>
                     <pic:cNvPicPr/>
                   </pic:nvPicPr>
-                  <pic:blipFill>
-                    <a:blip r:embed="rId11"/>
-                    <a:stretch>
-                      <a:fillRect/>
-                    </a:stretch>
+                  <pic:blipFill rotWithShape="1">
+                    <a:blip r:embed="rId12"/>
+                    <a:srcRect r="68570" b="30364"/>
+                    <a:stretch/>
                   </pic:blipFill>
-                  <pic:spPr>
+                  <pic:spPr bwMode="auto">
                     <a:xfrm>
                       <a:off x="0" y="0"/>
-                      <a:ext cx="5612130" cy="1113790"/>
+                      <a:ext cx="2570325" cy="1130174"/>
                     </a:xfrm>
                     <a:prstGeom prst="rect">
                       <a:avLst/>
                     </a:prstGeom>
+                    <a:ln>
+                      <a:noFill/>
+                    </a:ln>
+                    <a:extLst>
+                      <a:ext uri="{53640926-AAD7-44D8-BBD7-CCE9431645EC}">
+                        <a14:shadowObscured xmlns:a14="http://schemas.microsoft.com/office/drawing/2010/main"/>
+                      </a:ext>
+                    </a:extLst>
                   </pic:spPr>
                 </pic:pic>
               </a:graphicData>
@@ -1214,12 +2676,605 @@
     </w:p>
     <w:p>
       <w:r>
-        <w:t xml:space="preserve">Mostrar los registros </w:t>
+        <w:t xml:space="preserve">Imagen 4: esta figura nos permite visualizar la manera en la que se presentan los datos al usuario cuando selecciona la opción de ver registros. </w:t>
+      </w:r>
+    </w:p>
+    <w:p>
+      <w:pPr>
+        <w:jc w:val="both"/>
+        <w:rPr>
+          <w:b/>
+          <w:bCs/>
+        </w:rPr>
+      </w:pPr>
+      <w:r>
+        <w:rPr>
+          <w:b/>
+          <w:bCs/>
+        </w:rPr>
+        <w:lastRenderedPageBreak/>
+        <w:t>Problemas detectados:</w:t>
+      </w:r>
+      <w:r>
+        <w:rPr>
+          <w:b/>
+          <w:bCs/>
+        </w:rPr>
+        <w:t xml:space="preserve"> </w:t>
+      </w:r>
+    </w:p>
+    <w:p>
+      <w:pPr>
+        <w:pStyle w:val="Ttulo2"/>
+        <w:jc w:val="both"/>
+        <w:rPr>
+          <w:rFonts w:ascii="Calibri" w:eastAsia="Calibri" w:hAnsi="Calibri" w:cs="Calibri"/>
+          <w:color w:val="auto"/>
+          <w:sz w:val="22"/>
+          <w:szCs w:val="22"/>
+        </w:rPr>
+      </w:pPr>
+      <w:r>
+        <w:rPr>
+          <w:rFonts w:ascii="Calibri" w:eastAsia="Calibri" w:hAnsi="Calibri" w:cs="Calibri"/>
+          <w:color w:val="auto"/>
+          <w:sz w:val="22"/>
+          <w:szCs w:val="22"/>
+        </w:rPr>
+        <w:t>Base de datos inexistente</w:t>
+      </w:r>
+    </w:p>
+    <w:p>
+      <w:pPr>
+        <w:numPr>
+          <w:ilvl w:val="0"/>
+          <w:numId w:val="1"/>
+        </w:numPr>
+        <w:spacing w:before="100" w:beforeAutospacing="1" w:after="100" w:afterAutospacing="1" w:line="240" w:lineRule="auto"/>
+        <w:jc w:val="both"/>
+      </w:pPr>
+      <w:r>
+        <w:t xml:space="preserve">Qué error aparece: Error de </w:t>
+      </w:r>
+      <w:r>
+        <w:t>conexión (</w:t>
+      </w:r>
+      <w:proofErr w:type="spellStart"/>
+      <w:r>
+        <w:t>Unknown</w:t>
+      </w:r>
+      <w:proofErr w:type="spellEnd"/>
+      <w:r>
+        <w:t xml:space="preserve"> </w:t>
+      </w:r>
+      <w:proofErr w:type="spellStart"/>
+      <w:r>
+        <w:t>database</w:t>
+      </w:r>
+      <w:proofErr w:type="spellEnd"/>
+      <w:r>
+        <w:t>).</w:t>
+      </w:r>
+    </w:p>
+    <w:p>
+      <w:pPr>
+        <w:numPr>
+          <w:ilvl w:val="0"/>
+          <w:numId w:val="1"/>
+        </w:numPr>
+        <w:spacing w:before="100" w:beforeAutospacing="1" w:after="100" w:afterAutospacing="1" w:line="240" w:lineRule="auto"/>
+        <w:jc w:val="both"/>
+      </w:pPr>
+      <w:r>
+        <w:t>En qué parte ocurre: Al hacer consultas SQL</w:t>
+      </w:r>
+      <w:r>
+        <w:t>.</w:t>
+      </w:r>
+    </w:p>
+    <w:p>
+      <w:pPr>
+        <w:numPr>
+          <w:ilvl w:val="0"/>
+          <w:numId w:val="1"/>
+        </w:numPr>
+        <w:spacing w:before="100" w:beforeAutospacing="1" w:after="100" w:afterAutospacing="1" w:line="240" w:lineRule="auto"/>
+        <w:jc w:val="both"/>
+      </w:pPr>
+      <w:r>
+        <w:t>Por qué ocurre: Porque MySQL no encuentra la base de datos</w:t>
+      </w:r>
+      <w:r>
+        <w:t>.</w:t>
+      </w:r>
+      <w:r>
+        <w:t xml:space="preserve"> </w:t>
+      </w:r>
+    </w:p>
+    <w:p>
+      <w:pPr>
+        <w:numPr>
+          <w:ilvl w:val="0"/>
+          <w:numId w:val="1"/>
+        </w:numPr>
+        <w:spacing w:before="100" w:beforeAutospacing="1" w:after="100" w:afterAutospacing="1" w:line="240" w:lineRule="auto"/>
+        <w:jc w:val="both"/>
+      </w:pPr>
+      <w:r>
+        <w:t>Impacto: El sistema</w:t>
+      </w:r>
+      <w:r>
+        <w:t xml:space="preserve"> no puede continuar y se detiene la ejecución</w:t>
+      </w:r>
+    </w:p>
+    <w:p>
+      <w:pPr>
+        <w:pStyle w:val="Ttulo2"/>
+        <w:jc w:val="both"/>
+        <w:rPr>
+          <w:rFonts w:ascii="Calibri" w:eastAsia="Calibri" w:hAnsi="Calibri" w:cs="Calibri"/>
+          <w:color w:val="auto"/>
+          <w:sz w:val="22"/>
+          <w:szCs w:val="22"/>
+        </w:rPr>
+      </w:pPr>
+      <w:r>
+        <w:rPr>
+          <w:rFonts w:ascii="Calibri" w:eastAsia="Calibri" w:hAnsi="Calibri" w:cs="Calibri"/>
+          <w:color w:val="auto"/>
+          <w:sz w:val="22"/>
+          <w:szCs w:val="22"/>
+        </w:rPr>
+        <w:t>Tabla inexistente</w:t>
+      </w:r>
+    </w:p>
+    <w:p>
+      <w:pPr>
+        <w:numPr>
+          <w:ilvl w:val="0"/>
+          <w:numId w:val="2"/>
+        </w:numPr>
+        <w:spacing w:before="100" w:beforeAutospacing="1" w:after="100" w:afterAutospacing="1" w:line="240" w:lineRule="auto"/>
+        <w:jc w:val="both"/>
+      </w:pPr>
+      <w:r>
+        <w:t xml:space="preserve">Qué error aparece: “Table </w:t>
+      </w:r>
+      <w:proofErr w:type="spellStart"/>
+      <w:r>
+        <w:t>doesn't</w:t>
+      </w:r>
+      <w:proofErr w:type="spellEnd"/>
+      <w:r>
+        <w:t xml:space="preserve"> </w:t>
+      </w:r>
+      <w:proofErr w:type="spellStart"/>
+      <w:r>
+        <w:t>exist</w:t>
+      </w:r>
+      <w:proofErr w:type="spellEnd"/>
+      <w:r>
+        <w:t>”</w:t>
+      </w:r>
+      <w:r>
+        <w:t>.</w:t>
+      </w:r>
+    </w:p>
+    <w:p>
+      <w:pPr>
+        <w:numPr>
+          <w:ilvl w:val="0"/>
+          <w:numId w:val="2"/>
+        </w:numPr>
+        <w:spacing w:before="100" w:beforeAutospacing="1" w:after="100" w:afterAutospacing="1" w:line="240" w:lineRule="auto"/>
+        <w:jc w:val="both"/>
+      </w:pPr>
+      <w:r>
+        <w:t>En qué parte ocurre: En consultas INSERT o SELECT</w:t>
+      </w:r>
+      <w:r>
+        <w:t>.</w:t>
+      </w:r>
+    </w:p>
+    <w:p>
+      <w:pPr>
+        <w:numPr>
+          <w:ilvl w:val="0"/>
+          <w:numId w:val="2"/>
+        </w:numPr>
+        <w:spacing w:before="100" w:beforeAutospacing="1" w:after="100" w:afterAutospacing="1" w:line="240" w:lineRule="auto"/>
+        <w:jc w:val="both"/>
+      </w:pPr>
+      <w:r>
+        <w:t xml:space="preserve">Por qué ocurre: La </w:t>
+      </w:r>
+      <w:r>
+        <w:t>tabla de alumnos</w:t>
+      </w:r>
+      <w:r>
+        <w:t xml:space="preserve"> no está creada</w:t>
+      </w:r>
+      <w:r>
+        <w:t>.</w:t>
+      </w:r>
+    </w:p>
+    <w:p>
+      <w:pPr>
+        <w:numPr>
+          <w:ilvl w:val="0"/>
+          <w:numId w:val="2"/>
+        </w:numPr>
+        <w:spacing w:before="100" w:beforeAutospacing="1" w:after="100" w:afterAutospacing="1" w:line="240" w:lineRule="auto"/>
+        <w:jc w:val="both"/>
+      </w:pPr>
+      <w:r>
+        <w:t>Impacto: No se pueden guardar ni mostrar datos</w:t>
+      </w:r>
+      <w:r>
+        <w:t>.</w:t>
+      </w:r>
+    </w:p>
+    <w:p>
+      <w:pPr>
+        <w:pStyle w:val="Ttulo2"/>
+        <w:jc w:val="both"/>
+        <w:rPr>
+          <w:rFonts w:ascii="Calibri" w:eastAsia="Calibri" w:hAnsi="Calibri" w:cs="Calibri"/>
+          <w:color w:val="auto"/>
+          <w:sz w:val="22"/>
+          <w:szCs w:val="22"/>
+        </w:rPr>
+      </w:pPr>
+      <w:r>
+        <w:rPr>
+          <w:rFonts w:ascii="Calibri" w:eastAsia="Calibri" w:hAnsi="Calibri" w:cs="Calibri"/>
+          <w:color w:val="auto"/>
+          <w:sz w:val="22"/>
+          <w:szCs w:val="22"/>
+        </w:rPr>
+        <w:t>Credenciales incorrectas</w:t>
+      </w:r>
+    </w:p>
+    <w:p>
+      <w:pPr>
+        <w:numPr>
+          <w:ilvl w:val="0"/>
+          <w:numId w:val="3"/>
+        </w:numPr>
+        <w:spacing w:before="100" w:beforeAutospacing="1" w:after="100" w:afterAutospacing="1" w:line="240" w:lineRule="auto"/>
+        <w:jc w:val="both"/>
+      </w:pPr>
+      <w:r>
+        <w:t xml:space="preserve">Qué error aparece: “Access </w:t>
+      </w:r>
+      <w:proofErr w:type="spellStart"/>
+      <w:r>
+        <w:t>denied</w:t>
+      </w:r>
+      <w:proofErr w:type="spellEnd"/>
+      <w:r>
+        <w:t xml:space="preserve"> </w:t>
+      </w:r>
+      <w:proofErr w:type="spellStart"/>
+      <w:r>
+        <w:t>for</w:t>
+      </w:r>
+      <w:proofErr w:type="spellEnd"/>
+      <w:r>
+        <w:t xml:space="preserve"> </w:t>
+      </w:r>
+      <w:proofErr w:type="spellStart"/>
+      <w:r>
+        <w:t>user</w:t>
+      </w:r>
+      <w:proofErr w:type="spellEnd"/>
+      <w:r>
+        <w:t xml:space="preserve">” </w:t>
+      </w:r>
+    </w:p>
+    <w:p>
+      <w:pPr>
+        <w:numPr>
+          <w:ilvl w:val="0"/>
+          <w:numId w:val="3"/>
+        </w:numPr>
+        <w:spacing w:before="100" w:beforeAutospacing="1" w:after="100" w:afterAutospacing="1" w:line="240" w:lineRule="auto"/>
+        <w:jc w:val="both"/>
+      </w:pPr>
+      <w:r>
+        <w:t xml:space="preserve">En qué parte ocurre: En new </w:t>
+      </w:r>
+      <w:proofErr w:type="spellStart"/>
+      <w:r>
+        <w:t>mysqli</w:t>
+      </w:r>
+      <w:proofErr w:type="spellEnd"/>
+      <w:r>
+        <w:t>($host, $</w:t>
+      </w:r>
+      <w:proofErr w:type="spellStart"/>
+      <w:r>
+        <w:t>user</w:t>
+      </w:r>
+      <w:proofErr w:type="spellEnd"/>
+      <w:r>
+        <w:t>, $</w:t>
+      </w:r>
+      <w:proofErr w:type="spellStart"/>
+      <w:r>
+        <w:t>pass</w:t>
+      </w:r>
+      <w:proofErr w:type="spellEnd"/>
+      <w:r>
+        <w:t xml:space="preserve">) </w:t>
+      </w:r>
+    </w:p>
+    <w:p>
+      <w:pPr>
+        <w:numPr>
+          <w:ilvl w:val="0"/>
+          <w:numId w:val="3"/>
+        </w:numPr>
+        <w:spacing w:before="100" w:beforeAutospacing="1" w:after="100" w:afterAutospacing="1" w:line="240" w:lineRule="auto"/>
+        <w:jc w:val="both"/>
+      </w:pPr>
+      <w:r>
+        <w:t xml:space="preserve">Por qué ocurre: Usuario o contraseña incorrectos en </w:t>
+      </w:r>
+      <w:proofErr w:type="spellStart"/>
+      <w:r>
+        <w:t>config.php</w:t>
+      </w:r>
+      <w:proofErr w:type="spellEnd"/>
+      <w:r>
+        <w:t xml:space="preserve"> </w:t>
+      </w:r>
+    </w:p>
+    <w:p>
+      <w:pPr>
+        <w:numPr>
+          <w:ilvl w:val="0"/>
+          <w:numId w:val="3"/>
+        </w:numPr>
+        <w:spacing w:before="100" w:beforeAutospacing="1" w:after="100" w:afterAutospacing="1" w:line="240" w:lineRule="auto"/>
+        <w:jc w:val="both"/>
+      </w:pPr>
+      <w:r>
+        <w:t>Impacto: No se p</w:t>
+      </w:r>
+      <w:r>
+        <w:t>uede hacer</w:t>
+      </w:r>
+      <w:r>
+        <w:t xml:space="preserve"> la conexión al servidor </w:t>
+      </w:r>
+    </w:p>
+    <w:p>
+      <w:pPr>
+        <w:pStyle w:val="Ttulo2"/>
+        <w:jc w:val="both"/>
+        <w:rPr>
+          <w:rFonts w:ascii="Calibri" w:eastAsia="Calibri" w:hAnsi="Calibri" w:cs="Calibri"/>
+          <w:color w:val="auto"/>
+          <w:sz w:val="22"/>
+          <w:szCs w:val="22"/>
+        </w:rPr>
+      </w:pPr>
+      <w:r>
+        <w:rPr>
+          <w:rFonts w:ascii="Calibri" w:eastAsia="Calibri" w:hAnsi="Calibri" w:cs="Calibri"/>
+          <w:color w:val="auto"/>
+          <w:sz w:val="22"/>
+          <w:szCs w:val="22"/>
+        </w:rPr>
+        <w:t>Error en consulta SQL</w:t>
+      </w:r>
+    </w:p>
+    <w:p>
+      <w:pPr>
+        <w:numPr>
+          <w:ilvl w:val="0"/>
+          <w:numId w:val="4"/>
+        </w:numPr>
+        <w:spacing w:before="100" w:beforeAutospacing="1" w:after="100" w:afterAutospacing="1" w:line="240" w:lineRule="auto"/>
+        <w:jc w:val="both"/>
+      </w:pPr>
+      <w:r>
+        <w:t>Qué error aparece: Error de sintaxis SQL</w:t>
+      </w:r>
+      <w:r>
+        <w:t>.</w:t>
+      </w:r>
+    </w:p>
+    <w:p>
+      <w:pPr>
+        <w:numPr>
+          <w:ilvl w:val="0"/>
+          <w:numId w:val="4"/>
+        </w:numPr>
+        <w:spacing w:before="100" w:beforeAutospacing="1" w:after="100" w:afterAutospacing="1" w:line="240" w:lineRule="auto"/>
+        <w:jc w:val="both"/>
+      </w:pPr>
+      <w:r>
+        <w:t>En qué parte ocurre: Al ejecutar INSERT o SELECT</w:t>
+      </w:r>
+      <w:r>
+        <w:t>.</w:t>
+      </w:r>
+    </w:p>
+    <w:p>
+      <w:pPr>
+        <w:numPr>
+          <w:ilvl w:val="0"/>
+          <w:numId w:val="4"/>
+        </w:numPr>
+        <w:spacing w:before="100" w:beforeAutospacing="1" w:after="100" w:afterAutospacing="1" w:line="240" w:lineRule="auto"/>
+        <w:jc w:val="both"/>
+      </w:pPr>
+      <w:r>
+        <w:t>Por qué ocurre: Consulta mal escrita o datos incorrectos</w:t>
+      </w:r>
+      <w:r>
+        <w:t>.</w:t>
+      </w:r>
+    </w:p>
+    <w:p>
+      <w:pPr>
+        <w:numPr>
+          <w:ilvl w:val="0"/>
+          <w:numId w:val="4"/>
+        </w:numPr>
+        <w:spacing w:before="100" w:beforeAutospacing="1" w:after="100" w:afterAutospacing="1" w:line="240" w:lineRule="auto"/>
+        <w:jc w:val="both"/>
+      </w:pPr>
+      <w:r>
+        <w:t xml:space="preserve">Impacto: No se ejecuta la </w:t>
+      </w:r>
+      <w:r>
+        <w:t>consulta.</w:t>
       </w:r>
     </w:p>
     <w:p/>
-    <w:p/>
-    <w:p/>
+    <w:p>
+      <w:pPr>
+        <w:rPr>
+          <w:b/>
+          <w:bCs/>
+        </w:rPr>
+      </w:pPr>
+      <w:r>
+        <w:rPr>
+          <w:b/>
+          <w:bCs/>
+        </w:rPr>
+        <w:t>Soluciones propuestas:</w:t>
+      </w:r>
+    </w:p>
+    <w:p>
+      <w:pPr>
+        <w:pStyle w:val="NormalWeb"/>
+        <w:jc w:val="both"/>
+        <w:rPr>
+          <w:rFonts w:ascii="Calibri" w:eastAsia="Calibri" w:hAnsi="Calibri" w:cs="Calibri"/>
+          <w:sz w:val="22"/>
+          <w:szCs w:val="22"/>
+        </w:rPr>
+      </w:pPr>
+      <w:r>
+        <w:rPr>
+          <w:rFonts w:ascii="Calibri" w:eastAsia="Calibri" w:hAnsi="Calibri" w:cs="Calibri"/>
+          <w:sz w:val="22"/>
+          <w:szCs w:val="22"/>
+        </w:rPr>
+        <w:t xml:space="preserve">El sistema detecta algunos errores durante su ejecución, principalmente en la conexión a la base de datos mediante </w:t>
+      </w:r>
+      <w:proofErr w:type="spellStart"/>
+      <w:r>
+        <w:rPr>
+          <w:rFonts w:ascii="Calibri" w:eastAsia="Calibri" w:hAnsi="Calibri" w:cs="Calibri"/>
+          <w:sz w:val="22"/>
+          <w:szCs w:val="22"/>
+        </w:rPr>
+        <w:t>connect_error</w:t>
+      </w:r>
+      <w:proofErr w:type="spellEnd"/>
+      <w:r>
+        <w:rPr>
+          <w:rFonts w:ascii="Calibri" w:eastAsia="Calibri" w:hAnsi="Calibri" w:cs="Calibri"/>
+          <w:sz w:val="22"/>
+          <w:szCs w:val="22"/>
+        </w:rPr>
+        <w:t>, lo que permite identificar fallos en los datos de conexión. Cuando ocurre un error, el sistema muestra un mensaje en pantalla indicando que la conexión no fue exitosa y detiene la ejecución para evitar continuar con procesos incorrectos.</w:t>
+      </w:r>
+      <w:r>
+        <w:rPr>
+          <w:rFonts w:ascii="Calibri" w:eastAsia="Calibri" w:hAnsi="Calibri" w:cs="Calibri"/>
+          <w:sz w:val="22"/>
+          <w:szCs w:val="22"/>
+        </w:rPr>
+        <w:t xml:space="preserve"> </w:t>
+      </w:r>
+      <w:r>
+        <w:rPr>
+          <w:rFonts w:ascii="Calibri" w:eastAsia="Calibri" w:hAnsi="Calibri" w:cs="Calibri"/>
+          <w:sz w:val="22"/>
+          <w:szCs w:val="22"/>
+        </w:rPr>
+        <w:t>Además, MySQL genera mensajes automáticos cuando ocurre un error en las consultas SQL, lo que permite identificar problemas en la ejecución de instrucciones como INSERT o SELECT.</w:t>
+      </w:r>
+    </w:p>
+    <w:p>
+      <w:pPr>
+        <w:pStyle w:val="NormalWeb"/>
+        <w:jc w:val="both"/>
+        <w:rPr>
+          <w:rFonts w:ascii="Calibri" w:eastAsia="Calibri" w:hAnsi="Calibri" w:cs="Calibri"/>
+          <w:sz w:val="22"/>
+          <w:szCs w:val="22"/>
+        </w:rPr>
+      </w:pPr>
+      <w:r>
+        <w:rPr>
+          <w:rFonts w:ascii="Calibri" w:eastAsia="Calibri" w:hAnsi="Calibri" w:cs="Calibri"/>
+          <w:sz w:val="22"/>
+          <w:szCs w:val="22"/>
+        </w:rPr>
+        <w:t>Se podrían implementar mejoras en el manejo de errores para hacer el sistema más seguro. Por ejemplo, mostrar mensajes más amigables para el usuario en lugar de mensajes técnicos de MySQL.</w:t>
+      </w:r>
+      <w:r>
+        <w:rPr>
+          <w:rFonts w:ascii="Calibri" w:eastAsia="Calibri" w:hAnsi="Calibri" w:cs="Calibri"/>
+          <w:sz w:val="22"/>
+          <w:szCs w:val="22"/>
+        </w:rPr>
+        <w:t xml:space="preserve"> </w:t>
+      </w:r>
+      <w:r>
+        <w:rPr>
+          <w:rFonts w:ascii="Calibri" w:eastAsia="Calibri" w:hAnsi="Calibri" w:cs="Calibri"/>
+          <w:sz w:val="22"/>
+          <w:szCs w:val="22"/>
+        </w:rPr>
+        <w:t>También se recomienda validar los datos antes de ejecutar consultas SQL para evitar errores por campos vacíos o incorrectos, así como utilizar estructuras de control que permitan manejar mejor los errores sin detener completamente el sistema.</w:t>
+      </w:r>
+      <w:r>
+        <w:rPr>
+          <w:rFonts w:ascii="Calibri" w:eastAsia="Calibri" w:hAnsi="Calibri" w:cs="Calibri"/>
+          <w:sz w:val="22"/>
+          <w:szCs w:val="22"/>
+        </w:rPr>
+        <w:t xml:space="preserve"> </w:t>
+      </w:r>
+      <w:r>
+        <w:rPr>
+          <w:rFonts w:ascii="Calibri" w:eastAsia="Calibri" w:hAnsi="Calibri" w:cs="Calibri"/>
+          <w:sz w:val="22"/>
+          <w:szCs w:val="22"/>
+        </w:rPr>
+        <w:t>Finalmente, se podría implementar un sistema de registro de errores (logs) para almacenar los fallos sin mostrarlos directamente en pantalla.</w:t>
+      </w:r>
+    </w:p>
+    <w:p>
+      <w:pPr>
+        <w:rPr>
+          <w:b/>
+          <w:bCs/>
+        </w:rPr>
+      </w:pPr>
+      <w:r>
+        <w:rPr>
+          <w:b/>
+          <w:bCs/>
+        </w:rPr>
+        <w:lastRenderedPageBreak/>
+        <w:t>Conclusión personal:</w:t>
+      </w:r>
+    </w:p>
+    <w:p>
+      <w:r>
+        <w:t xml:space="preserve">Después de realizar esta practica de </w:t>
+      </w:r>
+    </w:p>
     <w:p/>
     <w:sectPr>
       <w:pgSz w:w="12240" w:h="15840"/>
@@ -1229,6 +3284,619 @@
     </w:sectPr>
   </w:body>
 </w:document>
+</file>
+
+<file path=word/numbering.xml><?xml version="1.0" encoding="utf-8"?>
+<w:numbering xmlns:wpc="http://schemas.microsoft.com/office/word/2010/wordprocessingCanvas" xmlns:cx="http://schemas.microsoft.com/office/drawing/2014/chartex" xmlns:cx1="http://schemas.microsoft.com/office/drawing/2015/9/8/chartex" xmlns:cx2="http://schemas.microsoft.com/office/drawing/2015/10/21/chartex" xmlns:cx3="http://schemas.microsoft.com/office/drawing/2016/5/9/chartex" xmlns:cx4="http://schemas.microsoft.com/office/drawing/2016/5/10/chartex" xmlns:cx5="http://schemas.microsoft.com/office/drawing/2016/5/11/chartex" xmlns:cx6="http://schemas.microsoft.com/office/drawing/2016/5/12/chartex" xmlns:cx7="http://schemas.microsoft.com/office/drawing/2016/5/13/chartex" xmlns:cx8="http://schemas.microsoft.com/office/drawing/2016/5/14/chartex" xmlns:mc="http://schemas.openxmlformats.org/markup-compatibility/2006" xmlns:aink="http://schemas.microsoft.com/office/drawing/2016/ink" xmlns:am3d="http://schemas.microsoft.com/office/drawing/2017/model3d" xmlns:o="urn:schemas-microsoft-com:office:office" xmlns:r="http://schemas.openxmlformats.org/officeDocument/2006/relationships" xmlns:m="http://schemas.openxmlformats.org/officeDocument/2006/math" xmlns:v="urn:schemas-microsoft-com:vml" xmlns:wp14="http://schemas.microsoft.com/office/word/2010/wordprocessingDrawing" xmlns:wp="http://schemas.openxmlformats.org/drawingml/2006/wordprocessingDrawing" xmlns:w10="urn:schemas-microsoft-com:office:word" xmlns:w="http://schemas.openxmlformats.org/wordprocessingml/2006/main" xmlns:w14="http://schemas.microsoft.com/office/word/2010/wordml" xmlns:w15="http://schemas.microsoft.com/office/word/2012/wordml" xmlns:w16cex="http://schemas.microsoft.com/office/word/2018/wordml/cex" xmlns:w16cid="http://schemas.microsoft.com/office/word/2016/wordml/cid" xmlns:w16="http://schemas.microsoft.com/office/word/2018/wordml" xmlns:w16sdtdh="http://schemas.microsoft.com/office/word/2020/wordml/sdtdatahash" xmlns:w16se="http://schemas.microsoft.com/office/word/2015/wordml/symex" xmlns:wpg="http://schemas.microsoft.com/office/word/2010/wordprocessingGroup" xmlns:wpi="http://schemas.microsoft.com/office/word/2010/wordprocessingInk" xmlns:wne="http://schemas.microsoft.com/office/word/2006/wordml" xmlns:wps="http://schemas.microsoft.com/office/word/2010/wordprocessingShape" mc:Ignorable="w14 w15 w16se w16cid w16 w16cex w16sdtdh wp14">
+  <w:abstractNum w:abstractNumId="0" w15:restartNumberingAfterBreak="0">
+    <w:nsid w:val="00C652C7"/>
+    <w:multiLevelType w:val="multilevel"/>
+    <w:tmpl w:val="CA12A22E"/>
+    <w:lvl w:ilvl="0">
+      <w:start w:val="1"/>
+      <w:numFmt w:val="bullet"/>
+      <w:lvlText w:val=""/>
+      <w:lvlJc w:val="left"/>
+      <w:pPr>
+        <w:tabs>
+          <w:tab w:val="num" w:pos="720"/>
+        </w:tabs>
+        <w:ind w:left="720" w:hanging="360"/>
+      </w:pPr>
+      <w:rPr>
+        <w:rFonts w:ascii="Symbol" w:hAnsi="Symbol" w:hint="default"/>
+        <w:sz w:val="20"/>
+      </w:rPr>
+    </w:lvl>
+    <w:lvl w:ilvl="1" w:tentative="1">
+      <w:start w:val="1"/>
+      <w:numFmt w:val="bullet"/>
+      <w:lvlText w:val="o"/>
+      <w:lvlJc w:val="left"/>
+      <w:pPr>
+        <w:tabs>
+          <w:tab w:val="num" w:pos="1440"/>
+        </w:tabs>
+        <w:ind w:left="1440" w:hanging="360"/>
+      </w:pPr>
+      <w:rPr>
+        <w:rFonts w:ascii="Courier New" w:hAnsi="Courier New" w:hint="default"/>
+        <w:sz w:val="20"/>
+      </w:rPr>
+    </w:lvl>
+    <w:lvl w:ilvl="2" w:tentative="1">
+      <w:start w:val="1"/>
+      <w:numFmt w:val="bullet"/>
+      <w:lvlText w:val=""/>
+      <w:lvlJc w:val="left"/>
+      <w:pPr>
+        <w:tabs>
+          <w:tab w:val="num" w:pos="2160"/>
+        </w:tabs>
+        <w:ind w:left="2160" w:hanging="360"/>
+      </w:pPr>
+      <w:rPr>
+        <w:rFonts w:ascii="Wingdings" w:hAnsi="Wingdings" w:hint="default"/>
+        <w:sz w:val="20"/>
+      </w:rPr>
+    </w:lvl>
+    <w:lvl w:ilvl="3" w:tentative="1">
+      <w:start w:val="1"/>
+      <w:numFmt w:val="bullet"/>
+      <w:lvlText w:val=""/>
+      <w:lvlJc w:val="left"/>
+      <w:pPr>
+        <w:tabs>
+          <w:tab w:val="num" w:pos="2880"/>
+        </w:tabs>
+        <w:ind w:left="2880" w:hanging="360"/>
+      </w:pPr>
+      <w:rPr>
+        <w:rFonts w:ascii="Wingdings" w:hAnsi="Wingdings" w:hint="default"/>
+        <w:sz w:val="20"/>
+      </w:rPr>
+    </w:lvl>
+    <w:lvl w:ilvl="4" w:tentative="1">
+      <w:start w:val="1"/>
+      <w:numFmt w:val="bullet"/>
+      <w:lvlText w:val=""/>
+      <w:lvlJc w:val="left"/>
+      <w:pPr>
+        <w:tabs>
+          <w:tab w:val="num" w:pos="3600"/>
+        </w:tabs>
+        <w:ind w:left="3600" w:hanging="360"/>
+      </w:pPr>
+      <w:rPr>
+        <w:rFonts w:ascii="Wingdings" w:hAnsi="Wingdings" w:hint="default"/>
+        <w:sz w:val="20"/>
+      </w:rPr>
+    </w:lvl>
+    <w:lvl w:ilvl="5" w:tentative="1">
+      <w:start w:val="1"/>
+      <w:numFmt w:val="bullet"/>
+      <w:lvlText w:val=""/>
+      <w:lvlJc w:val="left"/>
+      <w:pPr>
+        <w:tabs>
+          <w:tab w:val="num" w:pos="4320"/>
+        </w:tabs>
+        <w:ind w:left="4320" w:hanging="360"/>
+      </w:pPr>
+      <w:rPr>
+        <w:rFonts w:ascii="Wingdings" w:hAnsi="Wingdings" w:hint="default"/>
+        <w:sz w:val="20"/>
+      </w:rPr>
+    </w:lvl>
+    <w:lvl w:ilvl="6" w:tentative="1">
+      <w:start w:val="1"/>
+      <w:numFmt w:val="bullet"/>
+      <w:lvlText w:val=""/>
+      <w:lvlJc w:val="left"/>
+      <w:pPr>
+        <w:tabs>
+          <w:tab w:val="num" w:pos="5040"/>
+        </w:tabs>
+        <w:ind w:left="5040" w:hanging="360"/>
+      </w:pPr>
+      <w:rPr>
+        <w:rFonts w:ascii="Wingdings" w:hAnsi="Wingdings" w:hint="default"/>
+        <w:sz w:val="20"/>
+      </w:rPr>
+    </w:lvl>
+    <w:lvl w:ilvl="7" w:tentative="1">
+      <w:start w:val="1"/>
+      <w:numFmt w:val="bullet"/>
+      <w:lvlText w:val=""/>
+      <w:lvlJc w:val="left"/>
+      <w:pPr>
+        <w:tabs>
+          <w:tab w:val="num" w:pos="5760"/>
+        </w:tabs>
+        <w:ind w:left="5760" w:hanging="360"/>
+      </w:pPr>
+      <w:rPr>
+        <w:rFonts w:ascii="Wingdings" w:hAnsi="Wingdings" w:hint="default"/>
+        <w:sz w:val="20"/>
+      </w:rPr>
+    </w:lvl>
+    <w:lvl w:ilvl="8" w:tentative="1">
+      <w:start w:val="1"/>
+      <w:numFmt w:val="bullet"/>
+      <w:lvlText w:val=""/>
+      <w:lvlJc w:val="left"/>
+      <w:pPr>
+        <w:tabs>
+          <w:tab w:val="num" w:pos="6480"/>
+        </w:tabs>
+        <w:ind w:left="6480" w:hanging="360"/>
+      </w:pPr>
+      <w:rPr>
+        <w:rFonts w:ascii="Wingdings" w:hAnsi="Wingdings" w:hint="default"/>
+        <w:sz w:val="20"/>
+      </w:rPr>
+    </w:lvl>
+  </w:abstractNum>
+  <w:abstractNum w:abstractNumId="1" w15:restartNumberingAfterBreak="0">
+    <w:nsid w:val="3EB02722"/>
+    <w:multiLevelType w:val="multilevel"/>
+    <w:tmpl w:val="E4983AB0"/>
+    <w:lvl w:ilvl="0">
+      <w:start w:val="1"/>
+      <w:numFmt w:val="bullet"/>
+      <w:lvlText w:val=""/>
+      <w:lvlJc w:val="left"/>
+      <w:pPr>
+        <w:tabs>
+          <w:tab w:val="num" w:pos="720"/>
+        </w:tabs>
+        <w:ind w:left="720" w:hanging="360"/>
+      </w:pPr>
+      <w:rPr>
+        <w:rFonts w:ascii="Symbol" w:hAnsi="Symbol" w:hint="default"/>
+        <w:sz w:val="20"/>
+      </w:rPr>
+    </w:lvl>
+    <w:lvl w:ilvl="1" w:tentative="1">
+      <w:start w:val="1"/>
+      <w:numFmt w:val="bullet"/>
+      <w:lvlText w:val="o"/>
+      <w:lvlJc w:val="left"/>
+      <w:pPr>
+        <w:tabs>
+          <w:tab w:val="num" w:pos="1440"/>
+        </w:tabs>
+        <w:ind w:left="1440" w:hanging="360"/>
+      </w:pPr>
+      <w:rPr>
+        <w:rFonts w:ascii="Courier New" w:hAnsi="Courier New" w:hint="default"/>
+        <w:sz w:val="20"/>
+      </w:rPr>
+    </w:lvl>
+    <w:lvl w:ilvl="2" w:tentative="1">
+      <w:start w:val="1"/>
+      <w:numFmt w:val="bullet"/>
+      <w:lvlText w:val=""/>
+      <w:lvlJc w:val="left"/>
+      <w:pPr>
+        <w:tabs>
+          <w:tab w:val="num" w:pos="2160"/>
+        </w:tabs>
+        <w:ind w:left="2160" w:hanging="360"/>
+      </w:pPr>
+      <w:rPr>
+        <w:rFonts w:ascii="Wingdings" w:hAnsi="Wingdings" w:hint="default"/>
+        <w:sz w:val="20"/>
+      </w:rPr>
+    </w:lvl>
+    <w:lvl w:ilvl="3" w:tentative="1">
+      <w:start w:val="1"/>
+      <w:numFmt w:val="bullet"/>
+      <w:lvlText w:val=""/>
+      <w:lvlJc w:val="left"/>
+      <w:pPr>
+        <w:tabs>
+          <w:tab w:val="num" w:pos="2880"/>
+        </w:tabs>
+        <w:ind w:left="2880" w:hanging="360"/>
+      </w:pPr>
+      <w:rPr>
+        <w:rFonts w:ascii="Wingdings" w:hAnsi="Wingdings" w:hint="default"/>
+        <w:sz w:val="20"/>
+      </w:rPr>
+    </w:lvl>
+    <w:lvl w:ilvl="4" w:tentative="1">
+      <w:start w:val="1"/>
+      <w:numFmt w:val="bullet"/>
+      <w:lvlText w:val=""/>
+      <w:lvlJc w:val="left"/>
+      <w:pPr>
+        <w:tabs>
+          <w:tab w:val="num" w:pos="3600"/>
+        </w:tabs>
+        <w:ind w:left="3600" w:hanging="360"/>
+      </w:pPr>
+      <w:rPr>
+        <w:rFonts w:ascii="Wingdings" w:hAnsi="Wingdings" w:hint="default"/>
+        <w:sz w:val="20"/>
+      </w:rPr>
+    </w:lvl>
+    <w:lvl w:ilvl="5" w:tentative="1">
+      <w:start w:val="1"/>
+      <w:numFmt w:val="bullet"/>
+      <w:lvlText w:val=""/>
+      <w:lvlJc w:val="left"/>
+      <w:pPr>
+        <w:tabs>
+          <w:tab w:val="num" w:pos="4320"/>
+        </w:tabs>
+        <w:ind w:left="4320" w:hanging="360"/>
+      </w:pPr>
+      <w:rPr>
+        <w:rFonts w:ascii="Wingdings" w:hAnsi="Wingdings" w:hint="default"/>
+        <w:sz w:val="20"/>
+      </w:rPr>
+    </w:lvl>
+    <w:lvl w:ilvl="6" w:tentative="1">
+      <w:start w:val="1"/>
+      <w:numFmt w:val="bullet"/>
+      <w:lvlText w:val=""/>
+      <w:lvlJc w:val="left"/>
+      <w:pPr>
+        <w:tabs>
+          <w:tab w:val="num" w:pos="5040"/>
+        </w:tabs>
+        <w:ind w:left="5040" w:hanging="360"/>
+      </w:pPr>
+      <w:rPr>
+        <w:rFonts w:ascii="Wingdings" w:hAnsi="Wingdings" w:hint="default"/>
+        <w:sz w:val="20"/>
+      </w:rPr>
+    </w:lvl>
+    <w:lvl w:ilvl="7" w:tentative="1">
+      <w:start w:val="1"/>
+      <w:numFmt w:val="bullet"/>
+      <w:lvlText w:val=""/>
+      <w:lvlJc w:val="left"/>
+      <w:pPr>
+        <w:tabs>
+          <w:tab w:val="num" w:pos="5760"/>
+        </w:tabs>
+        <w:ind w:left="5760" w:hanging="360"/>
+      </w:pPr>
+      <w:rPr>
+        <w:rFonts w:ascii="Wingdings" w:hAnsi="Wingdings" w:hint="default"/>
+        <w:sz w:val="20"/>
+      </w:rPr>
+    </w:lvl>
+    <w:lvl w:ilvl="8" w:tentative="1">
+      <w:start w:val="1"/>
+      <w:numFmt w:val="bullet"/>
+      <w:lvlText w:val=""/>
+      <w:lvlJc w:val="left"/>
+      <w:pPr>
+        <w:tabs>
+          <w:tab w:val="num" w:pos="6480"/>
+        </w:tabs>
+        <w:ind w:left="6480" w:hanging="360"/>
+      </w:pPr>
+      <w:rPr>
+        <w:rFonts w:ascii="Wingdings" w:hAnsi="Wingdings" w:hint="default"/>
+        <w:sz w:val="20"/>
+      </w:rPr>
+    </w:lvl>
+  </w:abstractNum>
+  <w:abstractNum w:abstractNumId="2" w15:restartNumberingAfterBreak="0">
+    <w:nsid w:val="7191277E"/>
+    <w:multiLevelType w:val="multilevel"/>
+    <w:tmpl w:val="A8D8E44C"/>
+    <w:lvl w:ilvl="0">
+      <w:start w:val="1"/>
+      <w:numFmt w:val="bullet"/>
+      <w:lvlText w:val=""/>
+      <w:lvlJc w:val="left"/>
+      <w:pPr>
+        <w:tabs>
+          <w:tab w:val="num" w:pos="720"/>
+        </w:tabs>
+        <w:ind w:left="720" w:hanging="360"/>
+      </w:pPr>
+      <w:rPr>
+        <w:rFonts w:ascii="Symbol" w:hAnsi="Symbol" w:hint="default"/>
+        <w:sz w:val="20"/>
+      </w:rPr>
+    </w:lvl>
+    <w:lvl w:ilvl="1" w:tentative="1">
+      <w:start w:val="1"/>
+      <w:numFmt w:val="bullet"/>
+      <w:lvlText w:val="o"/>
+      <w:lvlJc w:val="left"/>
+      <w:pPr>
+        <w:tabs>
+          <w:tab w:val="num" w:pos="1440"/>
+        </w:tabs>
+        <w:ind w:left="1440" w:hanging="360"/>
+      </w:pPr>
+      <w:rPr>
+        <w:rFonts w:ascii="Courier New" w:hAnsi="Courier New" w:hint="default"/>
+        <w:sz w:val="20"/>
+      </w:rPr>
+    </w:lvl>
+    <w:lvl w:ilvl="2" w:tentative="1">
+      <w:start w:val="1"/>
+      <w:numFmt w:val="bullet"/>
+      <w:lvlText w:val=""/>
+      <w:lvlJc w:val="left"/>
+      <w:pPr>
+        <w:tabs>
+          <w:tab w:val="num" w:pos="2160"/>
+        </w:tabs>
+        <w:ind w:left="2160" w:hanging="360"/>
+      </w:pPr>
+      <w:rPr>
+        <w:rFonts w:ascii="Wingdings" w:hAnsi="Wingdings" w:hint="default"/>
+        <w:sz w:val="20"/>
+      </w:rPr>
+    </w:lvl>
+    <w:lvl w:ilvl="3" w:tentative="1">
+      <w:start w:val="1"/>
+      <w:numFmt w:val="bullet"/>
+      <w:lvlText w:val=""/>
+      <w:lvlJc w:val="left"/>
+      <w:pPr>
+        <w:tabs>
+          <w:tab w:val="num" w:pos="2880"/>
+        </w:tabs>
+        <w:ind w:left="2880" w:hanging="360"/>
+      </w:pPr>
+      <w:rPr>
+        <w:rFonts w:ascii="Wingdings" w:hAnsi="Wingdings" w:hint="default"/>
+        <w:sz w:val="20"/>
+      </w:rPr>
+    </w:lvl>
+    <w:lvl w:ilvl="4" w:tentative="1">
+      <w:start w:val="1"/>
+      <w:numFmt w:val="bullet"/>
+      <w:lvlText w:val=""/>
+      <w:lvlJc w:val="left"/>
+      <w:pPr>
+        <w:tabs>
+          <w:tab w:val="num" w:pos="3600"/>
+        </w:tabs>
+        <w:ind w:left="3600" w:hanging="360"/>
+      </w:pPr>
+      <w:rPr>
+        <w:rFonts w:ascii="Wingdings" w:hAnsi="Wingdings" w:hint="default"/>
+        <w:sz w:val="20"/>
+      </w:rPr>
+    </w:lvl>
+    <w:lvl w:ilvl="5" w:tentative="1">
+      <w:start w:val="1"/>
+      <w:numFmt w:val="bullet"/>
+      <w:lvlText w:val=""/>
+      <w:lvlJc w:val="left"/>
+      <w:pPr>
+        <w:tabs>
+          <w:tab w:val="num" w:pos="4320"/>
+        </w:tabs>
+        <w:ind w:left="4320" w:hanging="360"/>
+      </w:pPr>
+      <w:rPr>
+        <w:rFonts w:ascii="Wingdings" w:hAnsi="Wingdings" w:hint="default"/>
+        <w:sz w:val="20"/>
+      </w:rPr>
+    </w:lvl>
+    <w:lvl w:ilvl="6" w:tentative="1">
+      <w:start w:val="1"/>
+      <w:numFmt w:val="bullet"/>
+      <w:lvlText w:val=""/>
+      <w:lvlJc w:val="left"/>
+      <w:pPr>
+        <w:tabs>
+          <w:tab w:val="num" w:pos="5040"/>
+        </w:tabs>
+        <w:ind w:left="5040" w:hanging="360"/>
+      </w:pPr>
+      <w:rPr>
+        <w:rFonts w:ascii="Wingdings" w:hAnsi="Wingdings" w:hint="default"/>
+        <w:sz w:val="20"/>
+      </w:rPr>
+    </w:lvl>
+    <w:lvl w:ilvl="7" w:tentative="1">
+      <w:start w:val="1"/>
+      <w:numFmt w:val="bullet"/>
+      <w:lvlText w:val=""/>
+      <w:lvlJc w:val="left"/>
+      <w:pPr>
+        <w:tabs>
+          <w:tab w:val="num" w:pos="5760"/>
+        </w:tabs>
+        <w:ind w:left="5760" w:hanging="360"/>
+      </w:pPr>
+      <w:rPr>
+        <w:rFonts w:ascii="Wingdings" w:hAnsi="Wingdings" w:hint="default"/>
+        <w:sz w:val="20"/>
+      </w:rPr>
+    </w:lvl>
+    <w:lvl w:ilvl="8" w:tentative="1">
+      <w:start w:val="1"/>
+      <w:numFmt w:val="bullet"/>
+      <w:lvlText w:val=""/>
+      <w:lvlJc w:val="left"/>
+      <w:pPr>
+        <w:tabs>
+          <w:tab w:val="num" w:pos="6480"/>
+        </w:tabs>
+        <w:ind w:left="6480" w:hanging="360"/>
+      </w:pPr>
+      <w:rPr>
+        <w:rFonts w:ascii="Wingdings" w:hAnsi="Wingdings" w:hint="default"/>
+        <w:sz w:val="20"/>
+      </w:rPr>
+    </w:lvl>
+  </w:abstractNum>
+  <w:abstractNum w:abstractNumId="3" w15:restartNumberingAfterBreak="0">
+    <w:nsid w:val="7AFB4B3D"/>
+    <w:multiLevelType w:val="multilevel"/>
+    <w:tmpl w:val="3C3AC774"/>
+    <w:lvl w:ilvl="0">
+      <w:start w:val="1"/>
+      <w:numFmt w:val="bullet"/>
+      <w:lvlText w:val=""/>
+      <w:lvlJc w:val="left"/>
+      <w:pPr>
+        <w:tabs>
+          <w:tab w:val="num" w:pos="720"/>
+        </w:tabs>
+        <w:ind w:left="720" w:hanging="360"/>
+      </w:pPr>
+      <w:rPr>
+        <w:rFonts w:ascii="Symbol" w:hAnsi="Symbol" w:hint="default"/>
+        <w:sz w:val="20"/>
+      </w:rPr>
+    </w:lvl>
+    <w:lvl w:ilvl="1" w:tentative="1">
+      <w:start w:val="1"/>
+      <w:numFmt w:val="bullet"/>
+      <w:lvlText w:val="o"/>
+      <w:lvlJc w:val="left"/>
+      <w:pPr>
+        <w:tabs>
+          <w:tab w:val="num" w:pos="1440"/>
+        </w:tabs>
+        <w:ind w:left="1440" w:hanging="360"/>
+      </w:pPr>
+      <w:rPr>
+        <w:rFonts w:ascii="Courier New" w:hAnsi="Courier New" w:hint="default"/>
+        <w:sz w:val="20"/>
+      </w:rPr>
+    </w:lvl>
+    <w:lvl w:ilvl="2" w:tentative="1">
+      <w:start w:val="1"/>
+      <w:numFmt w:val="bullet"/>
+      <w:lvlText w:val=""/>
+      <w:lvlJc w:val="left"/>
+      <w:pPr>
+        <w:tabs>
+          <w:tab w:val="num" w:pos="2160"/>
+        </w:tabs>
+        <w:ind w:left="2160" w:hanging="360"/>
+      </w:pPr>
+      <w:rPr>
+        <w:rFonts w:ascii="Wingdings" w:hAnsi="Wingdings" w:hint="default"/>
+        <w:sz w:val="20"/>
+      </w:rPr>
+    </w:lvl>
+    <w:lvl w:ilvl="3" w:tentative="1">
+      <w:start w:val="1"/>
+      <w:numFmt w:val="bullet"/>
+      <w:lvlText w:val=""/>
+      <w:lvlJc w:val="left"/>
+      <w:pPr>
+        <w:tabs>
+          <w:tab w:val="num" w:pos="2880"/>
+        </w:tabs>
+        <w:ind w:left="2880" w:hanging="360"/>
+      </w:pPr>
+      <w:rPr>
+        <w:rFonts w:ascii="Wingdings" w:hAnsi="Wingdings" w:hint="default"/>
+        <w:sz w:val="20"/>
+      </w:rPr>
+    </w:lvl>
+    <w:lvl w:ilvl="4" w:tentative="1">
+      <w:start w:val="1"/>
+      <w:numFmt w:val="bullet"/>
+      <w:lvlText w:val=""/>
+      <w:lvlJc w:val="left"/>
+      <w:pPr>
+        <w:tabs>
+          <w:tab w:val="num" w:pos="3600"/>
+        </w:tabs>
+        <w:ind w:left="3600" w:hanging="360"/>
+      </w:pPr>
+      <w:rPr>
+        <w:rFonts w:ascii="Wingdings" w:hAnsi="Wingdings" w:hint="default"/>
+        <w:sz w:val="20"/>
+      </w:rPr>
+    </w:lvl>
+    <w:lvl w:ilvl="5" w:tentative="1">
+      <w:start w:val="1"/>
+      <w:numFmt w:val="bullet"/>
+      <w:lvlText w:val=""/>
+      <w:lvlJc w:val="left"/>
+      <w:pPr>
+        <w:tabs>
+          <w:tab w:val="num" w:pos="4320"/>
+        </w:tabs>
+        <w:ind w:left="4320" w:hanging="360"/>
+      </w:pPr>
+      <w:rPr>
+        <w:rFonts w:ascii="Wingdings" w:hAnsi="Wingdings" w:hint="default"/>
+        <w:sz w:val="20"/>
+      </w:rPr>
+    </w:lvl>
+    <w:lvl w:ilvl="6" w:tentative="1">
+      <w:start w:val="1"/>
+      <w:numFmt w:val="bullet"/>
+      <w:lvlText w:val=""/>
+      <w:lvlJc w:val="left"/>
+      <w:pPr>
+        <w:tabs>
+          <w:tab w:val="num" w:pos="5040"/>
+        </w:tabs>
+        <w:ind w:left="5040" w:hanging="360"/>
+      </w:pPr>
+      <w:rPr>
+        <w:rFonts w:ascii="Wingdings" w:hAnsi="Wingdings" w:hint="default"/>
+        <w:sz w:val="20"/>
+      </w:rPr>
+    </w:lvl>
+    <w:lvl w:ilvl="7" w:tentative="1">
+      <w:start w:val="1"/>
+      <w:numFmt w:val="bullet"/>
+      <w:lvlText w:val=""/>
+      <w:lvlJc w:val="left"/>
+      <w:pPr>
+        <w:tabs>
+          <w:tab w:val="num" w:pos="5760"/>
+        </w:tabs>
+        <w:ind w:left="5760" w:hanging="360"/>
+      </w:pPr>
+      <w:rPr>
+        <w:rFonts w:ascii="Wingdings" w:hAnsi="Wingdings" w:hint="default"/>
+        <w:sz w:val="20"/>
+      </w:rPr>
+    </w:lvl>
+    <w:lvl w:ilvl="8" w:tentative="1">
+      <w:start w:val="1"/>
+      <w:numFmt w:val="bullet"/>
+      <w:lvlText w:val=""/>
+      <w:lvlJc w:val="left"/>
+      <w:pPr>
+        <w:tabs>
+          <w:tab w:val="num" w:pos="6480"/>
+        </w:tabs>
+        <w:ind w:left="6480" w:hanging="360"/>
+      </w:pPr>
+      <w:rPr>
+        <w:rFonts w:ascii="Wingdings" w:hAnsi="Wingdings" w:hint="default"/>
+        <w:sz w:val="20"/>
+      </w:rPr>
+    </w:lvl>
+  </w:abstractNum>
+  <w:num w:numId="1">
+    <w:abstractNumId w:val="1"/>
+  </w:num>
+  <w:num w:numId="2">
+    <w:abstractNumId w:val="3"/>
+  </w:num>
+  <w:num w:numId="3">
+    <w:abstractNumId w:val="0"/>
+  </w:num>
+  <w:num w:numId="4">
+    <w:abstractNumId w:val="2"/>
+  </w:num>
+</w:numbering>
 </file>
 
 <file path=word/styles.xml><?xml version="1.0" encoding="utf-8"?>
@@ -1663,6 +4331,29 @@
       <w:szCs w:val="40"/>
     </w:rPr>
   </w:style>
+  <w:style w:type="paragraph" w:styleId="Ttulo2">
+    <w:name w:val="heading 2"/>
+    <w:basedOn w:val="Normal"/>
+    <w:next w:val="Normal"/>
+    <w:link w:val="Ttulo2Car"/>
+    <w:uiPriority w:val="9"/>
+    <w:semiHidden/>
+    <w:unhideWhenUsed/>
+    <w:qFormat/>
+    <w:rsid w:val="0089609E"/>
+    <w:pPr>
+      <w:keepNext/>
+      <w:keepLines/>
+      <w:spacing w:before="40" w:after="0"/>
+      <w:outlineLvl w:val="1"/>
+    </w:pPr>
+    <w:rPr>
+      <w:rFonts w:asciiTheme="majorHAnsi" w:eastAsiaTheme="majorEastAsia" w:hAnsiTheme="majorHAnsi" w:cstheme="majorBidi"/>
+      <w:color w:val="2F5496" w:themeColor="accent1" w:themeShade="BF"/>
+      <w:sz w:val="26"/>
+      <w:szCs w:val="26"/>
+    </w:rPr>
+  </w:style>
   <w:style w:type="character" w:default="1" w:styleId="Fuentedeprrafopredeter">
     <w:name w:val="Default Paragraph Font"/>
     <w:uiPriority w:val="1"/>
@@ -1710,7 +4401,6 @@
     <w:name w:val="Normal (Web)"/>
     <w:basedOn w:val="Normal"/>
     <w:uiPriority w:val="99"/>
-    <w:semiHidden/>
     <w:unhideWhenUsed/>
     <w:rsid w:val="00D15D1A"/>
     <w:pPr>
@@ -1733,6 +4423,116 @@
       <w:rFonts w:ascii="Courier New" w:eastAsia="Times New Roman" w:hAnsi="Courier New" w:cs="Courier New"/>
       <w:sz w:val="20"/>
       <w:szCs w:val="20"/>
+    </w:rPr>
+  </w:style>
+  <w:style w:type="character" w:customStyle="1" w:styleId="Ttulo2Car">
+    <w:name w:val="Título 2 Car"/>
+    <w:basedOn w:val="Fuentedeprrafopredeter"/>
+    <w:link w:val="Ttulo2"/>
+    <w:uiPriority w:val="9"/>
+    <w:semiHidden/>
+    <w:rsid w:val="0089609E"/>
+    <w:rPr>
+      <w:rFonts w:asciiTheme="majorHAnsi" w:eastAsiaTheme="majorEastAsia" w:hAnsiTheme="majorHAnsi" w:cstheme="majorBidi"/>
+      <w:color w:val="2F5496" w:themeColor="accent1" w:themeShade="BF"/>
+      <w:kern w:val="0"/>
+      <w:sz w:val="26"/>
+      <w:szCs w:val="26"/>
+      <w:lang w:eastAsia="es-MX"/>
+      <w14:ligatures w14:val="none"/>
+    </w:rPr>
+  </w:style>
+  <w:style w:type="character" w:styleId="Textoennegrita">
+    <w:name w:val="Strong"/>
+    <w:basedOn w:val="Fuentedeprrafopredeter"/>
+    <w:uiPriority w:val="22"/>
+    <w:qFormat/>
+    <w:rsid w:val="0089609E"/>
+    <w:rPr>
+      <w:b/>
+      <w:bCs/>
+    </w:rPr>
+  </w:style>
+  <w:style w:type="paragraph" w:styleId="z-Principiodelformulario">
+    <w:name w:val="HTML Top of Form"/>
+    <w:basedOn w:val="Normal"/>
+    <w:next w:val="Normal"/>
+    <w:link w:val="z-PrincipiodelformularioCar"/>
+    <w:hidden/>
+    <w:uiPriority w:val="99"/>
+    <w:semiHidden/>
+    <w:unhideWhenUsed/>
+    <w:rsid w:val="0089609E"/>
+    <w:pPr>
+      <w:pBdr>
+        <w:bottom w:val="single" w:sz="6" w:space="1" w:color="auto"/>
+      </w:pBdr>
+      <w:spacing w:after="0" w:line="240" w:lineRule="auto"/>
+      <w:jc w:val="center"/>
+    </w:pPr>
+    <w:rPr>
+      <w:rFonts w:ascii="Arial" w:eastAsia="Times New Roman" w:hAnsi="Arial" w:cs="Arial"/>
+      <w:vanish/>
+      <w:sz w:val="16"/>
+      <w:szCs w:val="16"/>
+    </w:rPr>
+  </w:style>
+  <w:style w:type="character" w:customStyle="1" w:styleId="z-PrincipiodelformularioCar">
+    <w:name w:val="z-Principio del formulario Car"/>
+    <w:basedOn w:val="Fuentedeprrafopredeter"/>
+    <w:link w:val="z-Principiodelformulario"/>
+    <w:uiPriority w:val="99"/>
+    <w:semiHidden/>
+    <w:rsid w:val="0089609E"/>
+    <w:rPr>
+      <w:rFonts w:ascii="Arial" w:eastAsia="Times New Roman" w:hAnsi="Arial" w:cs="Arial"/>
+      <w:vanish/>
+      <w:kern w:val="0"/>
+      <w:sz w:val="16"/>
+      <w:szCs w:val="16"/>
+      <w:lang w:eastAsia="es-MX"/>
+      <w14:ligatures w14:val="none"/>
+    </w:rPr>
+  </w:style>
+  <w:style w:type="paragraph" w:styleId="z-Finaldelformulario">
+    <w:name w:val="HTML Bottom of Form"/>
+    <w:basedOn w:val="Normal"/>
+    <w:next w:val="Normal"/>
+    <w:link w:val="z-FinaldelformularioCar"/>
+    <w:hidden/>
+    <w:uiPriority w:val="99"/>
+    <w:semiHidden/>
+    <w:unhideWhenUsed/>
+    <w:rsid w:val="0089609E"/>
+    <w:pPr>
+      <w:pBdr>
+        <w:top w:val="single" w:sz="6" w:space="1" w:color="auto"/>
+      </w:pBdr>
+      <w:spacing w:after="0" w:line="240" w:lineRule="auto"/>
+      <w:jc w:val="center"/>
+    </w:pPr>
+    <w:rPr>
+      <w:rFonts w:ascii="Arial" w:eastAsia="Times New Roman" w:hAnsi="Arial" w:cs="Arial"/>
+      <w:vanish/>
+      <w:sz w:val="16"/>
+      <w:szCs w:val="16"/>
+    </w:rPr>
+  </w:style>
+  <w:style w:type="character" w:customStyle="1" w:styleId="z-FinaldelformularioCar">
+    <w:name w:val="z-Final del formulario Car"/>
+    <w:basedOn w:val="Fuentedeprrafopredeter"/>
+    <w:link w:val="z-Finaldelformulario"/>
+    <w:uiPriority w:val="99"/>
+    <w:semiHidden/>
+    <w:rsid w:val="0089609E"/>
+    <w:rPr>
+      <w:rFonts w:ascii="Arial" w:eastAsia="Times New Roman" w:hAnsi="Arial" w:cs="Arial"/>
+      <w:vanish/>
+      <w:kern w:val="0"/>
+      <w:sz w:val="16"/>
+      <w:szCs w:val="16"/>
+      <w:lang w:eastAsia="es-MX"/>
+      <w14:ligatures w14:val="none"/>
     </w:rPr>
   </w:style>
 </w:styles>

</xml_diff>